<commit_message>
Fix table truncation: full-width card layout and correct column widths
Co-authored-by: arena-agent <297053741+arena-agent@users.noreply.github.com>
</commit_message>
<xml_diff>
--- a/بيرمت سستم (Final).docx
+++ b/بيرمت سستم (Final).docx
@@ -10,7 +10,7 @@
         <w:tblLayout w:type="fixed"/>
       </w:tblPr>
       <w:tblGrid>
-        <w:gridCol w:w="9866"/>
+        <w:gridCol w:w="9864"/>
       </w:tblGrid>
       <w:tr>
         <w:tc>
@@ -112,7 +112,6 @@
         <w:tblW w:type="auto" w:w="0"/>
         <w:tblLayout w:type="fixed"/>
         <w:tblLook w:firstColumn="1" w:firstRow="1" w:lastColumn="0" w:lastRow="0" w:noHBand="0" w:noVBand="1" w:val="04A0"/>
-        <w:tblLayout w:type="fixed"/>
         <w:tblBorders>
           <w:top w:val="single" w:sz="4" w:space="0" w:color="B7CCCF"/>
           <w:left w:val="single" w:sz="4" w:space="0" w:color="B7CCCF"/>
@@ -121,15 +120,16 @@
           <w:insideH w:val="single" w:sz="4" w:space="0" w:color="B7CCCF"/>
           <w:insideV w:val="single" w:sz="4" w:space="0" w:color="B7CCCF"/>
         </w:tblBorders>
+        <w:tblLayout w:type="fixed"/>
       </w:tblPr>
       <w:tblGrid>
-        <w:gridCol w:w="4933"/>
-        <w:gridCol w:w="4933"/>
+        <w:gridCol w:w="2834"/>
+        <w:gridCol w:w="7029"/>
       </w:tblGrid>
       <w:tr>
         <w:tc>
           <w:tcPr>
-            <w:tcW w:type="dxa" w:w="2948"/>
+            <w:tcW w:type="dxa" w:w="2835"/>
             <w:shd w:val="clear" w:color="auto" w:fill="DCEFF1"/>
             <w:tcMar>
               <w:top w:w="60" w:type="dxa"/>
@@ -156,7 +156,7 @@
         </w:tc>
         <w:tc>
           <w:tcPr>
-            <w:tcW w:type="dxa" w:w="6917"/>
+            <w:tcW w:type="dxa" w:w="7030"/>
             <w:tcMar>
               <w:top w:w="60" w:type="dxa"/>
               <w:bottom w:w="60" w:type="dxa"/>
@@ -184,7 +184,7 @@
       <w:tr>
         <w:tc>
           <w:tcPr>
-            <w:tcW w:type="dxa" w:w="2948"/>
+            <w:tcW w:type="dxa" w:w="2835"/>
             <w:shd w:val="clear" w:color="auto" w:fill="DCEFF1"/>
             <w:tcMar>
               <w:top w:w="60" w:type="dxa"/>
@@ -211,7 +211,7 @@
         </w:tc>
         <w:tc>
           <w:tcPr>
-            <w:tcW w:type="dxa" w:w="6917"/>
+            <w:tcW w:type="dxa" w:w="7030"/>
             <w:tcMar>
               <w:top w:w="60" w:type="dxa"/>
               <w:bottom w:w="60" w:type="dxa"/>
@@ -240,7 +240,7 @@
       <w:tr>
         <w:tc>
           <w:tcPr>
-            <w:tcW w:type="dxa" w:w="2948"/>
+            <w:tcW w:type="dxa" w:w="2835"/>
             <w:shd w:val="clear" w:color="auto" w:fill="DCEFF1"/>
             <w:tcMar>
               <w:top w:w="60" w:type="dxa"/>
@@ -267,7 +267,7 @@
         </w:tc>
         <w:tc>
           <w:tcPr>
-            <w:tcW w:type="dxa" w:w="6917"/>
+            <w:tcW w:type="dxa" w:w="7030"/>
             <w:tcMar>
               <w:top w:w="60" w:type="dxa"/>
               <w:bottom w:w="60" w:type="dxa"/>
@@ -295,7 +295,7 @@
       <w:tr>
         <w:tc>
           <w:tcPr>
-            <w:tcW w:type="dxa" w:w="2948"/>
+            <w:tcW w:type="dxa" w:w="2835"/>
             <w:shd w:val="clear" w:color="auto" w:fill="DCEFF1"/>
             <w:tcMar>
               <w:top w:w="60" w:type="dxa"/>
@@ -322,7 +322,7 @@
         </w:tc>
         <w:tc>
           <w:tcPr>
-            <w:tcW w:type="dxa" w:w="6917"/>
+            <w:tcW w:type="dxa" w:w="7030"/>
             <w:tcMar>
               <w:top w:w="60" w:type="dxa"/>
               <w:bottom w:w="60" w:type="dxa"/>
@@ -351,7 +351,7 @@
       <w:tr>
         <w:tc>
           <w:tcPr>
-            <w:tcW w:type="dxa" w:w="2948"/>
+            <w:tcW w:type="dxa" w:w="2835"/>
             <w:shd w:val="clear" w:color="auto" w:fill="DCEFF1"/>
             <w:tcMar>
               <w:top w:w="60" w:type="dxa"/>
@@ -378,7 +378,7 @@
         </w:tc>
         <w:tc>
           <w:tcPr>
-            <w:tcW w:type="dxa" w:w="6917"/>
+            <w:tcW w:type="dxa" w:w="7030"/>
             <w:tcMar>
               <w:top w:w="60" w:type="dxa"/>
               <w:bottom w:w="60" w:type="dxa"/>
@@ -406,7 +406,7 @@
       <w:tr>
         <w:tc>
           <w:tcPr>
-            <w:tcW w:type="dxa" w:w="2948"/>
+            <w:tcW w:type="dxa" w:w="2835"/>
             <w:shd w:val="clear" w:color="auto" w:fill="DCEFF1"/>
             <w:tcMar>
               <w:top w:w="60" w:type="dxa"/>
@@ -433,7 +433,7 @@
         </w:tc>
         <w:tc>
           <w:tcPr>
-            <w:tcW w:type="dxa" w:w="6917"/>
+            <w:tcW w:type="dxa" w:w="7030"/>
             <w:tcMar>
               <w:top w:w="60" w:type="dxa"/>
               <w:bottom w:w="60" w:type="dxa"/>
@@ -462,7 +462,7 @@
       <w:tr>
         <w:tc>
           <w:tcPr>
-            <w:tcW w:type="dxa" w:w="2948"/>
+            <w:tcW w:type="dxa" w:w="2835"/>
             <w:shd w:val="clear" w:color="auto" w:fill="DCEFF1"/>
             <w:tcMar>
               <w:top w:w="60" w:type="dxa"/>
@@ -489,7 +489,7 @@
         </w:tc>
         <w:tc>
           <w:tcPr>
-            <w:tcW w:type="dxa" w:w="6917"/>
+            <w:tcW w:type="dxa" w:w="7030"/>
             <w:tcMar>
               <w:top w:w="60" w:type="dxa"/>
               <w:bottom w:w="60" w:type="dxa"/>
@@ -569,7 +569,6 @@
         <w:tblW w:type="auto" w:w="0"/>
         <w:tblLayout w:type="fixed"/>
         <w:tblLook w:firstColumn="1" w:firstRow="1" w:lastColumn="0" w:lastRow="0" w:noHBand="0" w:noVBand="1" w:val="04A0"/>
-        <w:tblLayout w:type="fixed"/>
         <w:tblBorders>
           <w:top w:val="single" w:sz="4" w:space="0" w:color="B7CCCF"/>
           <w:left w:val="single" w:sz="4" w:space="0" w:color="B7CCCF"/>
@@ -578,15 +577,16 @@
           <w:insideH w:val="single" w:sz="4" w:space="0" w:color="B7CCCF"/>
           <w:insideV w:val="single" w:sz="4" w:space="0" w:color="B7CCCF"/>
         </w:tblBorders>
+        <w:tblLayout w:type="fixed"/>
       </w:tblPr>
       <w:tblGrid>
-        <w:gridCol w:w="4933"/>
-        <w:gridCol w:w="4933"/>
+        <w:gridCol w:w="2494"/>
+        <w:gridCol w:w="7370"/>
       </w:tblGrid>
       <w:tr>
         <w:tc>
           <w:tcPr>
-            <w:tcW w:type="dxa" w:w="4933"/>
+            <w:tcW w:type="dxa" w:w="2494"/>
             <w:shd w:val="clear" w:color="auto" w:fill="007E8C"/>
             <w:tcMar>
               <w:top w:w="60" w:type="dxa"/>
@@ -613,7 +613,7 @@
         </w:tc>
         <w:tc>
           <w:tcPr>
-            <w:tcW w:type="dxa" w:w="4933"/>
+            <w:tcW w:type="dxa" w:w="7370"/>
             <w:shd w:val="clear" w:color="auto" w:fill="007E8C"/>
             <w:tcMar>
               <w:top w:w="60" w:type="dxa"/>
@@ -642,7 +642,7 @@
       <w:tr>
         <w:tc>
           <w:tcPr>
-            <w:tcW w:type="dxa" w:w="2608"/>
+            <w:tcW w:type="dxa" w:w="2494"/>
             <w:tcMar>
               <w:top w:w="60" w:type="dxa"/>
               <w:bottom w:w="60" w:type="dxa"/>
@@ -661,7 +661,7 @@
                 <w:b/>
                 <w:i w:val="0"/>
                 <w:color w:val="003B4A"/>
-                <w:sz w:val="19"/>
+                <w:sz w:val="20"/>
               </w:rPr>
               <w:t>Permit Issuer (PI)</w:t>
             </w:r>
@@ -669,7 +669,7 @@
         </w:tc>
         <w:tc>
           <w:tcPr>
-            <w:tcW w:type="dxa" w:w="7257"/>
+            <w:tcW w:type="dxa" w:w="7370"/>
             <w:tcMar>
               <w:top w:w="60" w:type="dxa"/>
               <w:bottom w:w="60" w:type="dxa"/>
@@ -687,7 +687,7 @@
                 <w:b w:val="0"/>
                 <w:i w:val="0"/>
                 <w:color w:val="222A2E"/>
-                <w:sz w:val="19"/>
+                <w:sz w:val="20"/>
               </w:rPr>
               <w:t>Authorized Siemens Energy Engineer / EHS Supervisor responsible for assessing site conditions, verifying safety precautions, conducting joint inspections, and signing to issue permits.</w:t>
             </w:r>
@@ -702,7 +702,7 @@
                 <w:b w:val="0"/>
                 <w:i w:val="0"/>
                 <w:color w:val="222A2E"/>
-                <w:sz w:val="19"/>
+                <w:sz w:val="20"/>
               </w:rPr>
               <w:t>Issues permits on behalf of Siemens Energy; technical permit approval authority rests with the Area Authority for the work location.</w:t>
             </w:r>
@@ -712,7 +712,7 @@
       <w:tr>
         <w:tc>
           <w:tcPr>
-            <w:tcW w:type="dxa" w:w="2608"/>
+            <w:tcW w:type="dxa" w:w="2494"/>
             <w:tcMar>
               <w:top w:w="60" w:type="dxa"/>
               <w:bottom w:w="60" w:type="dxa"/>
@@ -732,7 +732,7 @@
                 <w:b/>
                 <w:i w:val="0"/>
                 <w:color w:val="003B4A"/>
-                <w:sz w:val="19"/>
+                <w:sz w:val="20"/>
               </w:rPr>
               <w:t>Permit Holder / Applicant (PH)</w:t>
             </w:r>
@@ -740,7 +740,7 @@
         </w:tc>
         <w:tc>
           <w:tcPr>
-            <w:tcW w:type="dxa" w:w="7257"/>
+            <w:tcW w:type="dxa" w:w="7370"/>
             <w:tcMar>
               <w:top w:w="60" w:type="dxa"/>
               <w:bottom w:w="60" w:type="dxa"/>
@@ -759,7 +759,7 @@
                 <w:b w:val="0"/>
                 <w:i w:val="0"/>
                 <w:color w:val="222A2E"/>
-                <w:sz w:val="19"/>
+                <w:sz w:val="20"/>
               </w:rPr>
               <w:t>Competent Subcontractor Supervisor / Engineer requesting the permit. Responsible for briefing workers on Job Safety Analysis (JSA), maintaining site safety, and closing permits at shift end.</w:t>
             </w:r>
@@ -769,7 +769,7 @@
       <w:tr>
         <w:tc>
           <w:tcPr>
-            <w:tcW w:type="dxa" w:w="2608"/>
+            <w:tcW w:type="dxa" w:w="2494"/>
             <w:tcMar>
               <w:top w:w="60" w:type="dxa"/>
               <w:bottom w:w="60" w:type="dxa"/>
@@ -788,7 +788,7 @@
                 <w:b/>
                 <w:i w:val="0"/>
                 <w:color w:val="003B4A"/>
-                <w:sz w:val="19"/>
+                <w:sz w:val="20"/>
               </w:rPr>
               <w:t>Area Authority (AA)</w:t>
             </w:r>
@@ -796,7 +796,7 @@
         </w:tc>
         <w:tc>
           <w:tcPr>
-            <w:tcW w:type="dxa" w:w="7257"/>
+            <w:tcW w:type="dxa" w:w="7370"/>
             <w:tcMar>
               <w:top w:w="60" w:type="dxa"/>
               <w:bottom w:w="60" w:type="dxa"/>
@@ -814,7 +814,7 @@
                 <w:b w:val="0"/>
                 <w:i w:val="0"/>
                 <w:color w:val="222A2E"/>
-                <w:sz w:val="19"/>
+                <w:sz w:val="20"/>
               </w:rPr>
               <w:t>Operational owner of the plant / equipment / area where the work takes place (Siemens Energy or Client / Operations as applicable). Holds technical permit approval authority, authorizes work within the area, coordinates simultaneous operations, and confirms the plant condition is safe for the activity.</w:t>
             </w:r>
@@ -824,7 +824,7 @@
       <w:tr>
         <w:tc>
           <w:tcPr>
-            <w:tcW w:type="dxa" w:w="2608"/>
+            <w:tcW w:type="dxa" w:w="2494"/>
             <w:tcMar>
               <w:top w:w="60" w:type="dxa"/>
               <w:bottom w:w="60" w:type="dxa"/>
@@ -844,7 +844,7 @@
                 <w:b/>
                 <w:i w:val="0"/>
                 <w:color w:val="003B4A"/>
-                <w:sz w:val="19"/>
+                <w:sz w:val="20"/>
               </w:rPr>
               <w:t>Authorized Electrical Person (AEP) / Isolation Authority (IA)</w:t>
             </w:r>
@@ -852,7 +852,7 @@
         </w:tc>
         <w:tc>
           <w:tcPr>
-            <w:tcW w:type="dxa" w:w="7257"/>
+            <w:tcW w:type="dxa" w:w="7370"/>
             <w:tcMar>
               <w:top w:w="60" w:type="dxa"/>
               <w:bottom w:w="60" w:type="dxa"/>
@@ -871,7 +871,7 @@
                 <w:b w:val="0"/>
                 <w:i w:val="0"/>
                 <w:color w:val="222A2E"/>
-                <w:sz w:val="19"/>
+                <w:sz w:val="20"/>
               </w:rPr>
               <w:t>Certified Electrical / Mechanical Engineer responsible for conducting high/low voltage isolations, commissioning testing, Arc Flash boundary assessments, grounding, LOTO application, and authorizing Electrical Cold/Hot Permits.</w:t>
             </w:r>
@@ -886,7 +886,7 @@
                 <w:b w:val="0"/>
                 <w:i w:val="0"/>
                 <w:color w:val="222A2E"/>
-                <w:sz w:val="19"/>
+                <w:sz w:val="20"/>
               </w:rPr>
               <w:t>As Isolation Authority, applies/removes isolations and controls the LOTO register independently of PTW validity.</w:t>
             </w:r>
@@ -896,7 +896,7 @@
       <w:tr>
         <w:tc>
           <w:tcPr>
-            <w:tcW w:type="dxa" w:w="2608"/>
+            <w:tcW w:type="dxa" w:w="2494"/>
             <w:tcMar>
               <w:top w:w="60" w:type="dxa"/>
               <w:bottom w:w="60" w:type="dxa"/>
@@ -915,7 +915,7 @@
                 <w:b/>
                 <w:i w:val="0"/>
                 <w:color w:val="003B4A"/>
-                <w:sz w:val="19"/>
+                <w:sz w:val="20"/>
               </w:rPr>
               <w:t>EHS Reviewer / Manager</w:t>
             </w:r>
@@ -923,7 +923,7 @@
         </w:tc>
         <w:tc>
           <w:tcPr>
-            <w:tcW w:type="dxa" w:w="7257"/>
+            <w:tcW w:type="dxa" w:w="7370"/>
             <w:tcMar>
               <w:top w:w="60" w:type="dxa"/>
               <w:bottom w:w="60" w:type="dxa"/>
@@ -941,7 +941,7 @@
                 <w:b w:val="0"/>
                 <w:i w:val="0"/>
                 <w:color w:val="222A2E"/>
-                <w:sz w:val="19"/>
+                <w:sz w:val="20"/>
               </w:rPr>
               <w:t>Audits PTW implementation, reviews high-risk permits (e.g., Electrical Hot/Commissioning, Confined Space, Critical Lifting, LOTO), conducts random site checks, and halts work if permit conditions are breached.</w:t>
             </w:r>
@@ -956,7 +956,7 @@
                 <w:b w:val="0"/>
                 <w:i w:val="0"/>
                 <w:color w:val="222A2E"/>
-                <w:sz w:val="19"/>
+                <w:sz w:val="20"/>
               </w:rPr>
               <w:t>EHS acts as reviewer and auditor only and holds no technical permit approval authority; technical approval rests with the responsible operational / Area Authority.</w:t>
             </w:r>
@@ -966,7 +966,7 @@
       <w:tr>
         <w:tc>
           <w:tcPr>
-            <w:tcW w:type="dxa" w:w="2608"/>
+            <w:tcW w:type="dxa" w:w="2494"/>
             <w:tcMar>
               <w:top w:w="60" w:type="dxa"/>
               <w:bottom w:w="60" w:type="dxa"/>
@@ -986,7 +986,7 @@
                 <w:b/>
                 <w:i w:val="0"/>
                 <w:color w:val="003B4A"/>
-                <w:sz w:val="19"/>
+                <w:sz w:val="20"/>
               </w:rPr>
               <w:t>Authorized Gas Tester (AGT)</w:t>
             </w:r>
@@ -994,7 +994,7 @@
         </w:tc>
         <w:tc>
           <w:tcPr>
-            <w:tcW w:type="dxa" w:w="7257"/>
+            <w:tcW w:type="dxa" w:w="7370"/>
             <w:tcMar>
               <w:top w:w="60" w:type="dxa"/>
               <w:bottom w:w="60" w:type="dxa"/>
@@ -1013,7 +1013,7 @@
                 <w:b w:val="0"/>
                 <w:i w:val="0"/>
                 <w:color w:val="222A2E"/>
-                <w:sz w:val="19"/>
+                <w:sz w:val="20"/>
               </w:rPr>
               <w:t>Certified individual responsible for testing and recording atmospheric conditions (O2, LEL, H2S, CO) for Confined Space and Hot Work permits.</w:t>
             </w:r>
@@ -1131,7 +1131,6 @@
         <w:tblW w:type="auto" w:w="0"/>
         <w:tblLayout w:type="fixed"/>
         <w:tblLook w:firstColumn="1" w:firstRow="1" w:lastColumn="0" w:lastRow="0" w:noHBand="0" w:noVBand="1" w:val="04A0"/>
-        <w:tblLayout w:type="fixed"/>
         <w:tblBorders>
           <w:top w:val="single" w:sz="4" w:space="0" w:color="B7CCCF"/>
           <w:left w:val="single" w:sz="4" w:space="0" w:color="B7CCCF"/>
@@ -1140,31 +1139,28 @@
           <w:insideH w:val="single" w:sz="4" w:space="0" w:color="B7CCCF"/>
           <w:insideV w:val="single" w:sz="4" w:space="0" w:color="B7CCCF"/>
         </w:tblBorders>
+        <w:tblLayout w:type="fixed"/>
       </w:tblPr>
       <w:tblGrid>
-        <w:gridCol w:w="1973"/>
-        <w:gridCol w:w="1973"/>
-        <w:gridCol w:w="1973"/>
-        <w:gridCol w:w="1973"/>
-        <w:gridCol w:w="1973"/>
+        <w:gridCol w:w="2494"/>
+        <w:gridCol w:w="7370"/>
       </w:tblGrid>
       <w:tr>
         <w:tc>
           <w:tcPr>
-            <w:tcW w:type="dxa" w:w="1701"/>
+            <w:tcW w:type="dxa" w:w="7370"/>
+            <w:gridSpan w:val="2"/>
             <w:shd w:val="clear" w:color="auto" w:fill="007E8C"/>
             <w:tcMar>
-              <w:top w:w="60" w:type="dxa"/>
-              <w:bottom w:w="60" w:type="dxa"/>
+              <w:top w:w="70" w:type="dxa"/>
+              <w:bottom w:w="70" w:type="dxa"/>
               <w:start w:w="110" w:type="dxa"/>
               <w:end w:w="110" w:type="dxa"/>
             </w:tcMar>
-            <w:vAlign w:val="center"/>
           </w:tcPr>
           <w:p>
             <w:pPr>
               <w:spacing w:after="40" w:before="20"/>
-              <w:jc w:val="center"/>
             </w:pPr>
             <w:r>
               <w:rPr>
@@ -1172,125 +1168,9 @@
                 <w:b/>
                 <w:i w:val="0"/>
                 <w:color w:val="FFFFFF"/>
-                <w:sz w:val="18"/>
+                <w:sz w:val="21"/>
               </w:rPr>
-              <w:t>Permit Category</w:t>
-            </w:r>
-          </w:p>
-        </w:tc>
-        <w:tc>
-          <w:tcPr>
-            <w:tcW w:type="dxa" w:w="1304"/>
-            <w:shd w:val="clear" w:color="auto" w:fill="007E8C"/>
-            <w:tcMar>
-              <w:top w:w="60" w:type="dxa"/>
-              <w:bottom w:w="60" w:type="dxa"/>
-              <w:start w:w="110" w:type="dxa"/>
-              <w:end w:w="110" w:type="dxa"/>
-            </w:tcMar>
-            <w:vAlign w:val="center"/>
-          </w:tcPr>
-          <w:p>
-            <w:pPr>
-              <w:spacing w:after="40" w:before="20"/>
-              <w:jc w:val="center"/>
-            </w:pPr>
-            <w:r>
-              <w:rPr>
-                <w:rFonts w:ascii="Calibri" w:hAnsi="Calibri"/>
-                <w:b/>
-                <w:i w:val="0"/>
-                <w:color w:val="FFFFFF"/>
-                <w:sz w:val="18"/>
-              </w:rPr>
-              <w:t>Validity / Renewal</w:t>
-            </w:r>
-          </w:p>
-        </w:tc>
-        <w:tc>
-          <w:tcPr>
-            <w:tcW w:type="dxa" w:w="2551"/>
-            <w:shd w:val="clear" w:color="auto" w:fill="007E8C"/>
-            <w:tcMar>
-              <w:top w:w="60" w:type="dxa"/>
-              <w:bottom w:w="60" w:type="dxa"/>
-              <w:start w:w="110" w:type="dxa"/>
-              <w:end w:w="110" w:type="dxa"/>
-            </w:tcMar>
-            <w:vAlign w:val="center"/>
-          </w:tcPr>
-          <w:p>
-            <w:pPr>
-              <w:spacing w:after="40" w:before="20"/>
-              <w:jc w:val="center"/>
-            </w:pPr>
-            <w:r>
-              <w:rPr>
-                <w:rFonts w:ascii="Calibri" w:hAnsi="Calibri"/>
-                <w:b/>
-                <w:i w:val="0"/>
-                <w:color w:val="FFFFFF"/>
-                <w:sz w:val="18"/>
-              </w:rPr>
-              <w:t>Scope of Activities Covered</w:t>
-            </w:r>
-          </w:p>
-        </w:tc>
-        <w:tc>
-          <w:tcPr>
-            <w:tcW w:type="dxa" w:w="2268"/>
-            <w:shd w:val="clear" w:color="auto" w:fill="007E8C"/>
-            <w:tcMar>
-              <w:top w:w="60" w:type="dxa"/>
-              <w:bottom w:w="60" w:type="dxa"/>
-              <w:start w:w="110" w:type="dxa"/>
-              <w:end w:w="110" w:type="dxa"/>
-            </w:tcMar>
-            <w:vAlign w:val="center"/>
-          </w:tcPr>
-          <w:p>
-            <w:pPr>
-              <w:spacing w:after="40" w:before="20"/>
-              <w:jc w:val="center"/>
-            </w:pPr>
-            <w:r>
-              <w:rPr>
-                <w:rFonts w:ascii="Calibri" w:hAnsi="Calibri"/>
-                <w:b/>
-                <w:i w:val="0"/>
-                <w:color w:val="FFFFFF"/>
-                <w:sz w:val="18"/>
-              </w:rPr>
-              <w:t>Mandatory Prerequisites &amp; Attachments</w:t>
-            </w:r>
-          </w:p>
-        </w:tc>
-        <w:tc>
-          <w:tcPr>
-            <w:tcW w:type="dxa" w:w="2041"/>
-            <w:shd w:val="clear" w:color="auto" w:fill="007E8C"/>
-            <w:tcMar>
-              <w:top w:w="60" w:type="dxa"/>
-              <w:bottom w:w="60" w:type="dxa"/>
-              <w:start w:w="110" w:type="dxa"/>
-              <w:end w:w="110" w:type="dxa"/>
-            </w:tcMar>
-            <w:vAlign w:val="center"/>
-          </w:tcPr>
-          <w:p>
-            <w:pPr>
-              <w:spacing w:after="40" w:before="20"/>
-              <w:jc w:val="center"/>
-            </w:pPr>
-            <w:r>
-              <w:rPr>
-                <w:rFonts w:ascii="Calibri" w:hAnsi="Calibri"/>
-                <w:b/>
-                <w:i w:val="0"/>
-                <w:color w:val="FFFFFF"/>
-                <w:sz w:val="18"/>
-              </w:rPr>
-              <w:t>Key On-Site Control Measures</w:t>
+              <w:t>1. General Cold Work Permit</w:t>
             </w:r>
           </w:p>
         </w:tc>
@@ -1298,13 +1178,14 @@
       <w:tr>
         <w:tc>
           <w:tcPr>
-            <w:tcW w:type="dxa" w:w="1701"/>
+            <w:tcW w:type="dxa" w:w="2494"/>
             <w:tcMar>
               <w:top w:w="60" w:type="dxa"/>
               <w:bottom w:w="60" w:type="dxa"/>
               <w:start w:w="110" w:type="dxa"/>
               <w:end w:w="110" w:type="dxa"/>
             </w:tcMar>
+            <w:shd w:val="clear" w:color="auto" w:fill="DCEFF1"/>
             <w:vAlign w:val="center"/>
           </w:tcPr>
           <w:p>
@@ -1317,49 +1198,21 @@
                 <w:b/>
                 <w:i w:val="0"/>
                 <w:color w:val="003B4A"/>
-                <w:sz w:val="18"/>
+                <w:sz w:val="19"/>
               </w:rPr>
-              <w:t>1. General Cold Work Permit</w:t>
+              <w:t>Validity / Renewal</w:t>
             </w:r>
           </w:p>
         </w:tc>
         <w:tc>
           <w:tcPr>
-            <w:tcW w:type="dxa" w:w="1304"/>
+            <w:tcW w:type="dxa" w:w="7370"/>
             <w:tcMar>
               <w:top w:w="60" w:type="dxa"/>
               <w:bottom w:w="60" w:type="dxa"/>
               <w:start w:w="110" w:type="dxa"/>
               <w:end w:w="110" w:type="dxa"/>
             </w:tcMar>
-            <w:vAlign w:val="center"/>
-          </w:tcPr>
-          <w:p>
-            <w:pPr>
-              <w:spacing w:after="40" w:before="20"/>
-            </w:pPr>
-            <w:r>
-              <w:rPr>
-                <w:rFonts w:ascii="Calibri" w:hAnsi="Calibri"/>
-                <w:b w:val="0"/>
-                <w:i/>
-                <w:color w:val="5A6469"/>
-                <w:sz w:val="18"/>
-              </w:rPr>
-              <w:t>Weekly (Max 7 Days with Daily Endorsement)</w:t>
-            </w:r>
-          </w:p>
-        </w:tc>
-        <w:tc>
-          <w:tcPr>
-            <w:tcW w:type="dxa" w:w="2551"/>
-            <w:tcMar>
-              <w:top w:w="60" w:type="dxa"/>
-              <w:bottom w:w="60" w:type="dxa"/>
-              <w:start w:w="110" w:type="dxa"/>
-              <w:end w:w="110" w:type="dxa"/>
-            </w:tcMar>
-            <w:vAlign w:val="center"/>
           </w:tcPr>
           <w:p>
             <w:pPr>
@@ -1371,63 +1224,9 @@
                 <w:b w:val="0"/>
                 <w:i w:val="0"/>
                 <w:color w:val="222A2E"/>
-                <w:sz w:val="18"/>
+                <w:sz w:val="20"/>
               </w:rPr>
-              <w:t>General mechanical assembly/disassembly, piping installation, routine civil works, and non-hazardous maintenance not involving heat or live energy.</w:t>
-            </w:r>
-          </w:p>
-        </w:tc>
-        <w:tc>
-          <w:tcPr>
-            <w:tcW w:type="dxa" w:w="2268"/>
-            <w:tcMar>
-              <w:top w:w="60" w:type="dxa"/>
-              <w:bottom w:w="60" w:type="dxa"/>
-              <w:start w:w="110" w:type="dxa"/>
-              <w:end w:w="110" w:type="dxa"/>
-            </w:tcMar>
-            <w:vAlign w:val="center"/>
-          </w:tcPr>
-          <w:p>
-            <w:pPr>
-              <w:spacing w:after="40" w:before="20"/>
-            </w:pPr>
-            <w:r>
-              <w:rPr>
-                <w:rFonts w:ascii="Calibri" w:hAnsi="Calibri"/>
-                <w:b w:val="0"/>
-                <w:i w:val="0"/>
-                <w:color w:val="222A2E"/>
-                <w:sz w:val="18"/>
-              </w:rPr>
-              <w:t>Approved JSA / Method Statement. Equipment pre-use inspection checklist.</w:t>
-            </w:r>
-          </w:p>
-        </w:tc>
-        <w:tc>
-          <w:tcPr>
-            <w:tcW w:type="dxa" w:w="2041"/>
-            <w:tcMar>
-              <w:top w:w="60" w:type="dxa"/>
-              <w:bottom w:w="60" w:type="dxa"/>
-              <w:start w:w="110" w:type="dxa"/>
-              <w:end w:w="110" w:type="dxa"/>
-            </w:tcMar>
-            <w:vAlign w:val="center"/>
-          </w:tcPr>
-          <w:p>
-            <w:pPr>
-              <w:spacing w:after="40" w:before="20"/>
-            </w:pPr>
-            <w:r>
-              <w:rPr>
-                <w:rFonts w:ascii="Calibri" w:hAnsi="Calibri"/>
-                <w:b w:val="0"/>
-                <w:i w:val="0"/>
-                <w:color w:val="222A2E"/>
-                <w:sz w:val="18"/>
-              </w:rPr>
-              <w:t>Standard PPE enforcement. Housekeeping and path barricading. Tool tethering and safe access routes.</w:t>
+              <w:t>Weekly (Max 7 Days with Daily Endorsement)</w:t>
             </w:r>
           </w:p>
         </w:tc>
@@ -1435,155 +1234,14 @@
       <w:tr>
         <w:tc>
           <w:tcPr>
-            <w:tcW w:type="dxa" w:w="1701"/>
+            <w:tcW w:type="dxa" w:w="2494"/>
             <w:tcMar>
               <w:top w:w="60" w:type="dxa"/>
               <w:bottom w:w="60" w:type="dxa"/>
               <w:start w:w="110" w:type="dxa"/>
               <w:end w:w="110" w:type="dxa"/>
             </w:tcMar>
-            <w:vAlign w:val="center"/>
-            <w:shd w:val="clear" w:color="auto" w:fill="EAF4F5"/>
-          </w:tcPr>
-          <w:p>
-            <w:pPr>
-              <w:spacing w:after="40" w:before="20"/>
-            </w:pPr>
-            <w:r>
-              <w:rPr>
-                <w:rFonts w:ascii="Calibri" w:hAnsi="Calibri"/>
-                <w:b/>
-                <w:i w:val="0"/>
-                <w:color w:val="003B4A"/>
-                <w:sz w:val="18"/>
-              </w:rPr>
-              <w:t>2. Electrical Cold Work Permit</w:t>
-            </w:r>
-          </w:p>
-        </w:tc>
-        <w:tc>
-          <w:tcPr>
-            <w:tcW w:type="dxa" w:w="1304"/>
-            <w:tcMar>
-              <w:top w:w="60" w:type="dxa"/>
-              <w:bottom w:w="60" w:type="dxa"/>
-              <w:start w:w="110" w:type="dxa"/>
-              <w:end w:w="110" w:type="dxa"/>
-            </w:tcMar>
-            <w:vAlign w:val="center"/>
-            <w:shd w:val="clear" w:color="auto" w:fill="EAF4F5"/>
-          </w:tcPr>
-          <w:p>
-            <w:pPr>
-              <w:spacing w:after="40" w:before="20"/>
-            </w:pPr>
-            <w:r>
-              <w:rPr>
-                <w:rFonts w:ascii="Calibri" w:hAnsi="Calibri"/>
-                <w:b w:val="0"/>
-                <w:i/>
-                <w:color w:val="5A6469"/>
-                <w:sz w:val="18"/>
-              </w:rPr>
-              <w:t>Weekly (Max 7 Days with Daily Endorsement)</w:t>
-            </w:r>
-          </w:p>
-        </w:tc>
-        <w:tc>
-          <w:tcPr>
-            <w:tcW w:type="dxa" w:w="2551"/>
-            <w:tcMar>
-              <w:top w:w="60" w:type="dxa"/>
-              <w:bottom w:w="60" w:type="dxa"/>
-              <w:start w:w="110" w:type="dxa"/>
-              <w:end w:w="110" w:type="dxa"/>
-            </w:tcMar>
-            <w:vAlign w:val="center"/>
-            <w:shd w:val="clear" w:color="auto" w:fill="EAF4F5"/>
-          </w:tcPr>
-          <w:p>
-            <w:pPr>
-              <w:spacing w:after="40" w:before="20"/>
-            </w:pPr>
-            <w:r>
-              <w:rPr>
-                <w:rFonts w:ascii="Calibri" w:hAnsi="Calibri"/>
-                <w:b w:val="0"/>
-                <w:i w:val="0"/>
-                <w:color w:val="222A2E"/>
-                <w:sz w:val="18"/>
-              </w:rPr>
-              <w:t>Non-energized electrical works, cable pulling, ladder tray installation, panel mounting, dead cable splicing, and general electrical installation activities (de-energized state).</w:t>
-            </w:r>
-          </w:p>
-        </w:tc>
-        <w:tc>
-          <w:tcPr>
-            <w:tcW w:type="dxa" w:w="2268"/>
-            <w:tcMar>
-              <w:top w:w="60" w:type="dxa"/>
-              <w:bottom w:w="60" w:type="dxa"/>
-              <w:start w:w="110" w:type="dxa"/>
-              <w:end w:w="110" w:type="dxa"/>
-            </w:tcMar>
-            <w:vAlign w:val="center"/>
-            <w:shd w:val="clear" w:color="auto" w:fill="EAF4F5"/>
-          </w:tcPr>
-          <w:p>
-            <w:pPr>
-              <w:spacing w:after="40" w:before="20"/>
-            </w:pPr>
-            <w:r>
-              <w:rPr>
-                <w:rFonts w:ascii="Calibri" w:hAnsi="Calibri"/>
-                <w:b w:val="0"/>
-                <w:i w:val="0"/>
-                <w:color w:val="222A2E"/>
-                <w:sz w:val="18"/>
-              </w:rPr>
-              <w:t>Approved JSA &amp; Installation Method Statement. Single-Line Diagram (SLD) / Layout Drawing. Insulated Tool Inspection Checklist.</w:t>
-            </w:r>
-          </w:p>
-        </w:tc>
-        <w:tc>
-          <w:tcPr>
-            <w:tcW w:type="dxa" w:w="2041"/>
-            <w:tcMar>
-              <w:top w:w="60" w:type="dxa"/>
-              <w:bottom w:w="60" w:type="dxa"/>
-              <w:start w:w="110" w:type="dxa"/>
-              <w:end w:w="110" w:type="dxa"/>
-            </w:tcMar>
-            <w:vAlign w:val="center"/>
-            <w:shd w:val="clear" w:color="auto" w:fill="EAF4F5"/>
-          </w:tcPr>
-          <w:p>
-            <w:pPr>
-              <w:spacing w:after="40" w:before="20"/>
-            </w:pPr>
-            <w:r>
-              <w:rPr>
-                <w:rFonts w:ascii="Calibri" w:hAnsi="Calibri"/>
-                <w:b w:val="0"/>
-                <w:i w:val="0"/>
-                <w:color w:val="222A2E"/>
-                <w:sz w:val="18"/>
-              </w:rPr>
-              <w:t>Verification of completely de-energized system state. Calibrated insulated hand tools (1000 V rated). Barricading around active installation zones. Standard electrical PPE (safety shoes, leather gloves).</w:t>
-            </w:r>
-          </w:p>
-        </w:tc>
-      </w:tr>
-      <w:tr>
-        <w:tc>
-          <w:tcPr>
-            <w:tcW w:type="dxa" w:w="1701"/>
-            <w:tcMar>
-              <w:top w:w="60" w:type="dxa"/>
-              <w:bottom w:w="60" w:type="dxa"/>
-              <w:start w:w="110" w:type="dxa"/>
-              <w:end w:w="110" w:type="dxa"/>
-            </w:tcMar>
+            <w:shd w:val="clear" w:color="auto" w:fill="DCEFF1"/>
             <w:vAlign w:val="center"/>
           </w:tcPr>
           <w:p>
@@ -1596,49 +1254,21 @@
                 <w:b/>
                 <w:i w:val="0"/>
                 <w:color w:val="003B4A"/>
-                <w:sz w:val="18"/>
+                <w:sz w:val="19"/>
               </w:rPr>
-              <w:t>3. Electrical Hot Work &amp; Commissioning Permit</w:t>
+              <w:t>Scope of Activities Covered</w:t>
             </w:r>
           </w:p>
         </w:tc>
         <w:tc>
           <w:tcPr>
-            <w:tcW w:type="dxa" w:w="1304"/>
+            <w:tcW w:type="dxa" w:w="7370"/>
             <w:tcMar>
               <w:top w:w="60" w:type="dxa"/>
               <w:bottom w:w="60" w:type="dxa"/>
               <w:start w:w="110" w:type="dxa"/>
               <w:end w:w="110" w:type="dxa"/>
             </w:tcMar>
-            <w:vAlign w:val="center"/>
-          </w:tcPr>
-          <w:p>
-            <w:pPr>
-              <w:spacing w:after="40" w:before="20"/>
-            </w:pPr>
-            <w:r>
-              <w:rPr>
-                <w:rFonts w:ascii="Calibri" w:hAnsi="Calibri"/>
-                <w:b w:val="0"/>
-                <w:i/>
-                <w:color w:val="5A6469"/>
-                <w:sz w:val="18"/>
-              </w:rPr>
-              <w:t>Daily (Must be renewed every shift)</w:t>
-            </w:r>
-          </w:p>
-        </w:tc>
-        <w:tc>
-          <w:tcPr>
-            <w:tcW w:type="dxa" w:w="2551"/>
-            <w:tcMar>
-              <w:top w:w="60" w:type="dxa"/>
-              <w:bottom w:w="60" w:type="dxa"/>
-              <w:start w:w="110" w:type="dxa"/>
-              <w:end w:w="110" w:type="dxa"/>
-            </w:tcMar>
-            <w:vAlign w:val="center"/>
           </w:tcPr>
           <w:p>
             <w:pPr>
@@ -1650,63 +1280,9 @@
                 <w:b w:val="0"/>
                 <w:i w:val="0"/>
                 <w:color w:val="222A2E"/>
-                <w:sz w:val="18"/>
+                <w:sz w:val="20"/>
               </w:rPr>
-              <w:t>Energized electrical works, commissioning activities, live testing/troubleshooting, switchgear energization, transformer testing, MCC energization, and HV/LV commissioning tasks.</w:t>
-            </w:r>
-          </w:p>
-        </w:tc>
-        <w:tc>
-          <w:tcPr>
-            <w:tcW w:type="dxa" w:w="2268"/>
-            <w:tcMar>
-              <w:top w:w="60" w:type="dxa"/>
-              <w:bottom w:w="60" w:type="dxa"/>
-              <w:start w:w="110" w:type="dxa"/>
-              <w:end w:w="110" w:type="dxa"/>
-            </w:tcMar>
-            <w:vAlign w:val="center"/>
-          </w:tcPr>
-          <w:p>
-            <w:pPr>
-              <w:spacing w:after="40" w:before="20"/>
-            </w:pPr>
-            <w:r>
-              <w:rPr>
-                <w:rFonts w:ascii="Calibri" w:hAnsi="Calibri"/>
-                <w:b w:val="0"/>
-                <w:i w:val="0"/>
-                <w:color w:val="222A2E"/>
-                <w:sz w:val="18"/>
-              </w:rPr>
-              <w:t>Approved JSA &amp; Commissioning Method Statement. SLD / Energization Plan. Arc Flash Risk Assessment &amp; Boundary Calculation. AEP Authorization Certificate.</w:t>
-            </w:r>
-          </w:p>
-        </w:tc>
-        <w:tc>
-          <w:tcPr>
-            <w:tcW w:type="dxa" w:w="2041"/>
-            <w:tcMar>
-              <w:top w:w="60" w:type="dxa"/>
-              <w:bottom w:w="60" w:type="dxa"/>
-              <w:start w:w="110" w:type="dxa"/>
-              <w:end w:w="110" w:type="dxa"/>
-            </w:tcMar>
-            <w:vAlign w:val="center"/>
-          </w:tcPr>
-          <w:p>
-            <w:pPr>
-              <w:spacing w:after="40" w:before="20"/>
-            </w:pPr>
-            <w:r>
-              <w:rPr>
-                <w:rFonts w:ascii="Calibri" w:hAnsi="Calibri"/>
-                <w:b w:val="0"/>
-                <w:i w:val="0"/>
-                <w:color w:val="222A2E"/>
-                <w:sz w:val="18"/>
-              </w:rPr>
-              <w:t>Arc Flash PPE Category 2/4 (face shield, flame-resistant suit/hood). Calibrated voltage detectors &amp; insulated tools. Dielectric insulating rubber mats at panel front. AEP supervision on-site. Barricading with Arc Flash warning signage.</w:t>
+              <w:t>General mechanical assembly/disassembly, piping installation, routine civil works, and non-hazardous maintenance not involving heat or live energy.</w:t>
             </w:r>
           </w:p>
         </w:tc>
@@ -1714,155 +1290,14 @@
       <w:tr>
         <w:tc>
           <w:tcPr>
-            <w:tcW w:type="dxa" w:w="1701"/>
+            <w:tcW w:type="dxa" w:w="2494"/>
             <w:tcMar>
               <w:top w:w="60" w:type="dxa"/>
               <w:bottom w:w="60" w:type="dxa"/>
               <w:start w:w="110" w:type="dxa"/>
               <w:end w:w="110" w:type="dxa"/>
             </w:tcMar>
-            <w:vAlign w:val="center"/>
-            <w:shd w:val="clear" w:color="auto" w:fill="EAF4F5"/>
-          </w:tcPr>
-          <w:p>
-            <w:pPr>
-              <w:spacing w:after="40" w:before="20"/>
-            </w:pPr>
-            <w:r>
-              <w:rPr>
-                <w:rFonts w:ascii="Calibri" w:hAnsi="Calibri"/>
-                <w:b/>
-                <w:i w:val="0"/>
-                <w:color w:val="003B4A"/>
-                <w:sz w:val="18"/>
-              </w:rPr>
-              <w:t>4. Energy Isolation (LOTO) Permit</w:t>
-            </w:r>
-          </w:p>
-        </w:tc>
-        <w:tc>
-          <w:tcPr>
-            <w:tcW w:type="dxa" w:w="1304"/>
-            <w:tcMar>
-              <w:top w:w="60" w:type="dxa"/>
-              <w:bottom w:w="60" w:type="dxa"/>
-              <w:start w:w="110" w:type="dxa"/>
-              <w:end w:w="110" w:type="dxa"/>
-            </w:tcMar>
-            <w:vAlign w:val="center"/>
-            <w:shd w:val="clear" w:color="auto" w:fill="EAF4F5"/>
-          </w:tcPr>
-          <w:p>
-            <w:pPr>
-              <w:spacing w:after="40" w:before="20"/>
-            </w:pPr>
-            <w:r>
-              <w:rPr>
-                <w:rFonts w:ascii="Calibri" w:hAnsi="Calibri"/>
-                <w:b w:val="0"/>
-                <w:i/>
-                <w:color w:val="5A6469"/>
-                <w:sz w:val="18"/>
-              </w:rPr>
-              <w:t>Daily (Must be renewed every shift)</w:t>
-            </w:r>
-          </w:p>
-        </w:tc>
-        <w:tc>
-          <w:tcPr>
-            <w:tcW w:type="dxa" w:w="2551"/>
-            <w:tcMar>
-              <w:top w:w="60" w:type="dxa"/>
-              <w:bottom w:w="60" w:type="dxa"/>
-              <w:start w:w="110" w:type="dxa"/>
-              <w:end w:w="110" w:type="dxa"/>
-            </w:tcMar>
-            <w:vAlign w:val="center"/>
-            <w:shd w:val="clear" w:color="auto" w:fill="EAF4F5"/>
-          </w:tcPr>
-          <w:p>
-            <w:pPr>
-              <w:spacing w:after="40" w:before="20"/>
-            </w:pPr>
-            <w:r>
-              <w:rPr>
-                <w:rFonts w:ascii="Calibri" w:hAnsi="Calibri"/>
-                <w:b w:val="0"/>
-                <w:i w:val="0"/>
-                <w:color w:val="222A2E"/>
-                <w:sz w:val="18"/>
-              </w:rPr>
-              <w:t>All mechanical, pneumatic, hydraulic, thermal, and electrical energy isolations associated with maintenance or commissioning activities. LOTO validity is managed separately from PTW validity: isolations remain under Isolation Authority control until formal de-isolation, regardless of permit expiry/renewal.</w:t>
-            </w:r>
-          </w:p>
-        </w:tc>
-        <w:tc>
-          <w:tcPr>
-            <w:tcW w:type="dxa" w:w="2268"/>
-            <w:tcMar>
-              <w:top w:w="60" w:type="dxa"/>
-              <w:bottom w:w="60" w:type="dxa"/>
-              <w:start w:w="110" w:type="dxa"/>
-              <w:end w:w="110" w:type="dxa"/>
-            </w:tcMar>
-            <w:vAlign w:val="center"/>
-            <w:shd w:val="clear" w:color="auto" w:fill="EAF4F5"/>
-          </w:tcPr>
-          <w:p>
-            <w:pPr>
-              <w:spacing w:after="40" w:before="20"/>
-            </w:pPr>
-            <w:r>
-              <w:rPr>
-                <w:rFonts w:ascii="Calibri" w:hAnsi="Calibri"/>
-                <w:b w:val="0"/>
-                <w:i w:val="0"/>
-                <w:color w:val="222A2E"/>
-                <w:sz w:val="18"/>
-              </w:rPr>
-              <w:t>Approved JSA &amp; Isolation Plan. P&amp;ID / SLD Isolation Drawing. LOTO Key Register &amp; Isolation Certificate.</w:t>
-            </w:r>
-          </w:p>
-        </w:tc>
-        <w:tc>
-          <w:tcPr>
-            <w:tcW w:type="dxa" w:w="2041"/>
-            <w:tcMar>
-              <w:top w:w="60" w:type="dxa"/>
-              <w:bottom w:w="60" w:type="dxa"/>
-              <w:start w:w="110" w:type="dxa"/>
-              <w:end w:w="110" w:type="dxa"/>
-            </w:tcMar>
-            <w:vAlign w:val="center"/>
-            <w:shd w:val="clear" w:color="auto" w:fill="EAF4F5"/>
-          </w:tcPr>
-          <w:p>
-            <w:pPr>
-              <w:spacing w:after="40" w:before="20"/>
-            </w:pPr>
-            <w:r>
-              <w:rPr>
-                <w:rFonts w:ascii="Calibri" w:hAnsi="Calibri"/>
-                <w:b w:val="0"/>
-                <w:i w:val="0"/>
-                <w:color w:val="222A2E"/>
-                <w:sz w:val="18"/>
-              </w:rPr>
-              <w:t>Physical padlocks, hasps, and “DO NOT OPERATE” tags applied. Zero Energy State verification test (voltage check, depressurization). Lockbox key containment under AEP control.</w:t>
-            </w:r>
-          </w:p>
-        </w:tc>
-      </w:tr>
-      <w:tr>
-        <w:tc>
-          <w:tcPr>
-            <w:tcW w:type="dxa" w:w="1701"/>
-            <w:tcMar>
-              <w:top w:w="60" w:type="dxa"/>
-              <w:bottom w:w="60" w:type="dxa"/>
-              <w:start w:w="110" w:type="dxa"/>
-              <w:end w:w="110" w:type="dxa"/>
-            </w:tcMar>
+            <w:shd w:val="clear" w:color="auto" w:fill="DCEFF1"/>
             <w:vAlign w:val="center"/>
           </w:tcPr>
           <w:p>
@@ -1875,49 +1310,21 @@
                 <w:b/>
                 <w:i w:val="0"/>
                 <w:color w:val="003B4A"/>
-                <w:sz w:val="18"/>
+                <w:sz w:val="19"/>
               </w:rPr>
-              <w:t>5. Hot Work Permit (Thermal / Open Flame)</w:t>
+              <w:t>Mandatory Prerequisites &amp; Attachments</w:t>
             </w:r>
           </w:p>
         </w:tc>
         <w:tc>
           <w:tcPr>
-            <w:tcW w:type="dxa" w:w="1304"/>
+            <w:tcW w:type="dxa" w:w="7370"/>
             <w:tcMar>
               <w:top w:w="60" w:type="dxa"/>
               <w:bottom w:w="60" w:type="dxa"/>
               <w:start w:w="110" w:type="dxa"/>
               <w:end w:w="110" w:type="dxa"/>
             </w:tcMar>
-            <w:vAlign w:val="center"/>
-          </w:tcPr>
-          <w:p>
-            <w:pPr>
-              <w:spacing w:after="40" w:before="20"/>
-            </w:pPr>
-            <w:r>
-              <w:rPr>
-                <w:rFonts w:ascii="Calibri" w:hAnsi="Calibri"/>
-                <w:b w:val="0"/>
-                <w:i/>
-                <w:color w:val="5A6469"/>
-                <w:sz w:val="18"/>
-              </w:rPr>
-              <w:t>Daily (Must be renewed every shift)</w:t>
-            </w:r>
-          </w:p>
-        </w:tc>
-        <w:tc>
-          <w:tcPr>
-            <w:tcW w:type="dxa" w:w="2551"/>
-            <w:tcMar>
-              <w:top w:w="60" w:type="dxa"/>
-              <w:bottom w:w="60" w:type="dxa"/>
-              <w:start w:w="110" w:type="dxa"/>
-              <w:end w:w="110" w:type="dxa"/>
-            </w:tcMar>
-            <w:vAlign w:val="center"/>
           </w:tcPr>
           <w:p>
             <w:pPr>
@@ -1929,63 +1336,9 @@
                 <w:b w:val="0"/>
                 <w:i w:val="0"/>
                 <w:color w:val="222A2E"/>
-                <w:sz w:val="18"/>
+                <w:sz w:val="20"/>
               </w:rPr>
-              <w:t>Welding, flame cutting, grinding, soldering, thermal spraying, or any activity producing sparks, open flames, or heat above 100°C.</w:t>
-            </w:r>
-          </w:p>
-        </w:tc>
-        <w:tc>
-          <w:tcPr>
-            <w:tcW w:type="dxa" w:w="2268"/>
-            <w:tcMar>
-              <w:top w:w="60" w:type="dxa"/>
-              <w:bottom w:w="60" w:type="dxa"/>
-              <w:start w:w="110" w:type="dxa"/>
-              <w:end w:w="110" w:type="dxa"/>
-            </w:tcMar>
-            <w:vAlign w:val="center"/>
-          </w:tcPr>
-          <w:p>
-            <w:pPr>
-              <w:spacing w:after="40" w:before="20"/>
-            </w:pPr>
-            <w:r>
-              <w:rPr>
-                <w:rFonts w:ascii="Calibri" w:hAnsi="Calibri"/>
-                <w:b w:val="0"/>
-                <w:i w:val="0"/>
-                <w:color w:val="222A2E"/>
-                <w:sz w:val="18"/>
-              </w:rPr>
-              <w:t>Approved JSA. Fire Watch appointment form. Gas Test certificate (if near fuel/chemical zones).</w:t>
-            </w:r>
-          </w:p>
-        </w:tc>
-        <w:tc>
-          <w:tcPr>
-            <w:tcW w:type="dxa" w:w="2041"/>
-            <w:tcMar>
-              <w:top w:w="60" w:type="dxa"/>
-              <w:bottom w:w="60" w:type="dxa"/>
-              <w:start w:w="110" w:type="dxa"/>
-              <w:end w:w="110" w:type="dxa"/>
-            </w:tcMar>
-            <w:vAlign w:val="center"/>
-          </w:tcPr>
-          <w:p>
-            <w:pPr>
-              <w:spacing w:after="40" w:before="20"/>
-            </w:pPr>
-            <w:r>
-              <w:rPr>
-                <w:rFonts w:ascii="Calibri" w:hAnsi="Calibri"/>
-                <w:b w:val="0"/>
-                <w:i w:val="0"/>
-                <w:color w:val="222A2E"/>
-                <w:sz w:val="18"/>
-              </w:rPr>
-              <w:t>Fire blanket containment &amp; 10 m combustible clearance. Dedicated Fire Watch during work + 30 min post-work. Min. 2× 10 kg Dry Chemical Powder / CO2 extinguishers at site.</w:t>
+              <w:t>Approved JSA / Method Statement. Equipment pre-use inspection checklist.</w:t>
             </w:r>
           </w:p>
         </w:tc>
@@ -1993,155 +1346,14 @@
       <w:tr>
         <w:tc>
           <w:tcPr>
-            <w:tcW w:type="dxa" w:w="1701"/>
+            <w:tcW w:type="dxa" w:w="2494"/>
             <w:tcMar>
               <w:top w:w="60" w:type="dxa"/>
               <w:bottom w:w="60" w:type="dxa"/>
               <w:start w:w="110" w:type="dxa"/>
               <w:end w:w="110" w:type="dxa"/>
             </w:tcMar>
-            <w:vAlign w:val="center"/>
-            <w:shd w:val="clear" w:color="auto" w:fill="EAF4F5"/>
-          </w:tcPr>
-          <w:p>
-            <w:pPr>
-              <w:spacing w:after="40" w:before="20"/>
-            </w:pPr>
-            <w:r>
-              <w:rPr>
-                <w:rFonts w:ascii="Calibri" w:hAnsi="Calibri"/>
-                <w:b/>
-                <w:i w:val="0"/>
-                <w:color w:val="003B4A"/>
-                <w:sz w:val="18"/>
-              </w:rPr>
-              <w:t>6. Excavation &amp; Trenching Permit</w:t>
-            </w:r>
-          </w:p>
-        </w:tc>
-        <w:tc>
-          <w:tcPr>
-            <w:tcW w:type="dxa" w:w="1304"/>
-            <w:tcMar>
-              <w:top w:w="60" w:type="dxa"/>
-              <w:bottom w:w="60" w:type="dxa"/>
-              <w:start w:w="110" w:type="dxa"/>
-              <w:end w:w="110" w:type="dxa"/>
-            </w:tcMar>
-            <w:vAlign w:val="center"/>
-            <w:shd w:val="clear" w:color="auto" w:fill="EAF4F5"/>
-          </w:tcPr>
-          <w:p>
-            <w:pPr>
-              <w:spacing w:after="40" w:before="20"/>
-            </w:pPr>
-            <w:r>
-              <w:rPr>
-                <w:rFonts w:ascii="Calibri" w:hAnsi="Calibri"/>
-                <w:b w:val="0"/>
-                <w:i/>
-                <w:color w:val="5A6469"/>
-                <w:sz w:val="18"/>
-              </w:rPr>
-              <w:t>Weekly (Max 7 Days with Daily Endorsement)</w:t>
-            </w:r>
-          </w:p>
-        </w:tc>
-        <w:tc>
-          <w:tcPr>
-            <w:tcW w:type="dxa" w:w="2551"/>
-            <w:tcMar>
-              <w:top w:w="60" w:type="dxa"/>
-              <w:bottom w:w="60" w:type="dxa"/>
-              <w:start w:w="110" w:type="dxa"/>
-              <w:end w:w="110" w:type="dxa"/>
-            </w:tcMar>
-            <w:vAlign w:val="center"/>
-            <w:shd w:val="clear" w:color="auto" w:fill="EAF4F5"/>
-          </w:tcPr>
-          <w:p>
-            <w:pPr>
-              <w:spacing w:after="40" w:before="20"/>
-            </w:pPr>
-            <w:r>
-              <w:rPr>
-                <w:rFonts w:ascii="Calibri" w:hAnsi="Calibri"/>
-                <w:b w:val="0"/>
-                <w:i w:val="0"/>
-                <w:color w:val="222A2E"/>
-                <w:sz w:val="18"/>
-              </w:rPr>
-              <w:t>Manual or mechanical digging, trenching, piling, or ground penetration exceeding 30 cm depth.</w:t>
-            </w:r>
-          </w:p>
-        </w:tc>
-        <w:tc>
-          <w:tcPr>
-            <w:tcW w:type="dxa" w:w="2268"/>
-            <w:tcMar>
-              <w:top w:w="60" w:type="dxa"/>
-              <w:bottom w:w="60" w:type="dxa"/>
-              <w:start w:w="110" w:type="dxa"/>
-              <w:end w:w="110" w:type="dxa"/>
-            </w:tcMar>
-            <w:vAlign w:val="center"/>
-            <w:shd w:val="clear" w:color="auto" w:fill="EAF4F5"/>
-          </w:tcPr>
-          <w:p>
-            <w:pPr>
-              <w:spacing w:after="40" w:before="20"/>
-            </w:pPr>
-            <w:r>
-              <w:rPr>
-                <w:rFonts w:ascii="Calibri" w:hAnsi="Calibri"/>
-                <w:b w:val="0"/>
-                <w:i w:val="0"/>
-                <w:color w:val="222A2E"/>
-                <w:sz w:val="18"/>
-              </w:rPr>
-              <w:t>Underground Utility Clearance Map (signed by Electrical/Instrumentation). Approved JSA &amp; Soil Classification.</w:t>
-            </w:r>
-          </w:p>
-        </w:tc>
-        <w:tc>
-          <w:tcPr>
-            <w:tcW w:type="dxa" w:w="2041"/>
-            <w:tcMar>
-              <w:top w:w="60" w:type="dxa"/>
-              <w:bottom w:w="60" w:type="dxa"/>
-              <w:start w:w="110" w:type="dxa"/>
-              <w:end w:w="110" w:type="dxa"/>
-            </w:tcMar>
-            <w:vAlign w:val="center"/>
-            <w:shd w:val="clear" w:color="auto" w:fill="EAF4F5"/>
-          </w:tcPr>
-          <w:p>
-            <w:pPr>
-              <w:spacing w:after="40" w:before="20"/>
-            </w:pPr>
-            <w:r>
-              <w:rPr>
-                <w:rFonts w:ascii="Calibri" w:hAnsi="Calibri"/>
-                <w:b w:val="0"/>
-                <w:i w:val="0"/>
-                <w:color w:val="222A2E"/>
-                <w:sz w:val="18"/>
-              </w:rPr>
-              <w:t>Shoring, benching, or sloped walls for excavations &gt; 1.2 m. Ladders positioned every 7.5 m for emergency egress. Spoil heaps set back at least 1.0 m from trench edge.</w:t>
-            </w:r>
-          </w:p>
-        </w:tc>
-      </w:tr>
-      <w:tr>
-        <w:tc>
-          <w:tcPr>
-            <w:tcW w:type="dxa" w:w="1701"/>
-            <w:tcMar>
-              <w:top w:w="60" w:type="dxa"/>
-              <w:bottom w:w="60" w:type="dxa"/>
-              <w:start w:w="110" w:type="dxa"/>
-              <w:end w:w="110" w:type="dxa"/>
-            </w:tcMar>
+            <w:shd w:val="clear" w:color="auto" w:fill="DCEFF1"/>
             <w:vAlign w:val="center"/>
           </w:tcPr>
           <w:p>
@@ -2154,49 +1366,21 @@
                 <w:b/>
                 <w:i w:val="0"/>
                 <w:color w:val="003B4A"/>
-                <w:sz w:val="18"/>
+                <w:sz w:val="19"/>
               </w:rPr>
-              <w:t>7. Lifting Permit (Mandatory Lifting Plan)</w:t>
+              <w:t>Key On-Site Control Measures</w:t>
             </w:r>
           </w:p>
         </w:tc>
         <w:tc>
           <w:tcPr>
-            <w:tcW w:type="dxa" w:w="1304"/>
+            <w:tcW w:type="dxa" w:w="7370"/>
             <w:tcMar>
               <w:top w:w="60" w:type="dxa"/>
               <w:bottom w:w="60" w:type="dxa"/>
               <w:start w:w="110" w:type="dxa"/>
               <w:end w:w="110" w:type="dxa"/>
             </w:tcMar>
-            <w:vAlign w:val="center"/>
-          </w:tcPr>
-          <w:p>
-            <w:pPr>
-              <w:spacing w:after="40" w:before="20"/>
-            </w:pPr>
-            <w:r>
-              <w:rPr>
-                <w:rFonts w:ascii="Calibri" w:hAnsi="Calibri"/>
-                <w:b w:val="0"/>
-                <w:i/>
-                <w:color w:val="5A6469"/>
-                <w:sz w:val="18"/>
-              </w:rPr>
-              <w:t>Daily (Must be renewed every shift)</w:t>
-            </w:r>
-          </w:p>
-        </w:tc>
-        <w:tc>
-          <w:tcPr>
-            <w:tcW w:type="dxa" w:w="2551"/>
-            <w:tcMar>
-              <w:top w:w="60" w:type="dxa"/>
-              <w:bottom w:w="60" w:type="dxa"/>
-              <w:start w:w="110" w:type="dxa"/>
-              <w:end w:w="110" w:type="dxa"/>
-            </w:tcMar>
-            <w:vAlign w:val="center"/>
           </w:tcPr>
           <w:p>
             <w:pPr>
@@ -2208,63 +1392,9 @@
                 <w:b w:val="0"/>
                 <w:i w:val="0"/>
                 <w:color w:val="222A2E"/>
-                <w:sz w:val="18"/>
+                <w:sz w:val="20"/>
               </w:rPr>
-              <w:t>ALL lifting operations using mobile cranes, tower cranes, overhead cranes, or heavy rigging gear without exception. Critical lifts (e.g., loads &gt; 75% of crane rated capacity, multi-crane lifts, lifts over live plant / energized equipment, tandem or non-routine heavy rigging) require a detailed, engineered Lifting Plan prepared, reviewed and approved by a competent lifting authority. Routine lifts (well within crane capacity, standard rigging) may proceed under a standard lift plan / rigging checklist attached to the permit.</w:t>
-            </w:r>
-          </w:p>
-        </w:tc>
-        <w:tc>
-          <w:tcPr>
-            <w:tcW w:type="dxa" w:w="2268"/>
-            <w:tcMar>
-              <w:top w:w="60" w:type="dxa"/>
-              <w:bottom w:w="60" w:type="dxa"/>
-              <w:start w:w="110" w:type="dxa"/>
-              <w:end w:w="110" w:type="dxa"/>
-            </w:tcMar>
-            <w:vAlign w:val="center"/>
-          </w:tcPr>
-          <w:p>
-            <w:pPr>
-              <w:spacing w:after="40" w:before="20"/>
-            </w:pPr>
-            <w:r>
-              <w:rPr>
-                <w:rFonts w:ascii="Calibri" w:hAnsi="Calibri"/>
-                <w:b w:val="0"/>
-                <w:i w:val="0"/>
-                <w:color w:val="222A2E"/>
-                <w:sz w:val="18"/>
-              </w:rPr>
-              <w:t>LIFTING PLAN – mandatory &amp; detailed for critical lifts; standard lift plan / rigging checklist for routine lifts (classified by the appointed lift planner). 3rd-party crane &amp; tackle certificates. Operator &amp; Rigger competency cards.</w:t>
-            </w:r>
-          </w:p>
-        </w:tc>
-        <w:tc>
-          <w:tcPr>
-            <w:tcW w:type="dxa" w:w="2041"/>
-            <w:tcMar>
-              <w:top w:w="60" w:type="dxa"/>
-              <w:bottom w:w="60" w:type="dxa"/>
-              <w:start w:w="110" w:type="dxa"/>
-              <w:end w:w="110" w:type="dxa"/>
-            </w:tcMar>
-            <w:vAlign w:val="center"/>
-          </w:tcPr>
-          <w:p>
-            <w:pPr>
-              <w:spacing w:after="40" w:before="20"/>
-            </w:pPr>
-            <w:r>
-              <w:rPr>
-                <w:rFonts w:ascii="Calibri" w:hAnsi="Calibri"/>
-                <w:b w:val="0"/>
-                <w:i w:val="0"/>
-                <w:color w:val="222A2E"/>
-                <w:sz w:val="18"/>
-              </w:rPr>
-              <w:t>Outriggers 100% extended on timber pads. Barricaded exclusion zone around swing radius. Taglines for load control; no lifts in winds &gt; 32 km/h.</w:t>
+              <w:t>Standard PPE enforcement. Housekeeping and path barricading. Tool tethering and safe access routes.</w:t>
             </w:r>
           </w:p>
         </w:tc>
@@ -2272,15 +1402,15 @@
       <w:tr>
         <w:tc>
           <w:tcPr>
-            <w:tcW w:type="dxa" w:w="1701"/>
+            <w:tcW w:type="dxa" w:w="7370"/>
+            <w:gridSpan w:val="2"/>
+            <w:shd w:val="clear" w:color="auto" w:fill="007E8C"/>
             <w:tcMar>
-              <w:top w:w="60" w:type="dxa"/>
-              <w:bottom w:w="60" w:type="dxa"/>
+              <w:top w:w="70" w:type="dxa"/>
+              <w:bottom w:w="70" w:type="dxa"/>
               <w:start w:w="110" w:type="dxa"/>
               <w:end w:w="110" w:type="dxa"/>
             </w:tcMar>
-            <w:vAlign w:val="center"/>
-            <w:shd w:val="clear" w:color="auto" w:fill="EAF4F5"/>
           </w:tcPr>
           <w:p>
             <w:pPr>
@@ -2291,122 +1421,10 @@
                 <w:rFonts w:ascii="Calibri" w:hAnsi="Calibri"/>
                 <w:b/>
                 <w:i w:val="0"/>
-                <w:color w:val="003B4A"/>
-                <w:sz w:val="18"/>
+                <w:color w:val="FFFFFF"/>
+                <w:sz w:val="21"/>
               </w:rPr>
-              <w:t>8. Work at Height Permit</w:t>
-            </w:r>
-          </w:p>
-        </w:tc>
-        <w:tc>
-          <w:tcPr>
-            <w:tcW w:type="dxa" w:w="1304"/>
-            <w:tcMar>
-              <w:top w:w="60" w:type="dxa"/>
-              <w:bottom w:w="60" w:type="dxa"/>
-              <w:start w:w="110" w:type="dxa"/>
-              <w:end w:w="110" w:type="dxa"/>
-            </w:tcMar>
-            <w:vAlign w:val="center"/>
-            <w:shd w:val="clear" w:color="auto" w:fill="EAF4F5"/>
-          </w:tcPr>
-          <w:p>
-            <w:pPr>
-              <w:spacing w:after="40" w:before="20"/>
-            </w:pPr>
-            <w:r>
-              <w:rPr>
-                <w:rFonts w:ascii="Calibri" w:hAnsi="Calibri"/>
-                <w:b w:val="0"/>
-                <w:i/>
-                <w:color w:val="5A6469"/>
-                <w:sz w:val="18"/>
-              </w:rPr>
-              <w:t>Daily (Must be renewed every shift)</w:t>
-            </w:r>
-          </w:p>
-        </w:tc>
-        <w:tc>
-          <w:tcPr>
-            <w:tcW w:type="dxa" w:w="2551"/>
-            <w:tcMar>
-              <w:top w:w="60" w:type="dxa"/>
-              <w:bottom w:w="60" w:type="dxa"/>
-              <w:start w:w="110" w:type="dxa"/>
-              <w:end w:w="110" w:type="dxa"/>
-            </w:tcMar>
-            <w:vAlign w:val="center"/>
-            <w:shd w:val="clear" w:color="auto" w:fill="EAF4F5"/>
-          </w:tcPr>
-          <w:p>
-            <w:pPr>
-              <w:spacing w:after="40" w:before="20"/>
-            </w:pPr>
-            <w:r>
-              <w:rPr>
-                <w:rFonts w:ascii="Calibri" w:hAnsi="Calibri"/>
-                <w:b w:val="0"/>
-                <w:i w:val="0"/>
-                <w:color w:val="222A2E"/>
-                <w:sz w:val="18"/>
-              </w:rPr>
-              <w:t>Any task performed at an elevated height of 1.8 meters or above where a fall hazard exists.</w:t>
-            </w:r>
-          </w:p>
-        </w:tc>
-        <w:tc>
-          <w:tcPr>
-            <w:tcW w:type="dxa" w:w="2268"/>
-            <w:tcMar>
-              <w:top w:w="60" w:type="dxa"/>
-              <w:bottom w:w="60" w:type="dxa"/>
-              <w:start w:w="110" w:type="dxa"/>
-              <w:end w:w="110" w:type="dxa"/>
-            </w:tcMar>
-            <w:vAlign w:val="center"/>
-            <w:shd w:val="clear" w:color="auto" w:fill="EAF4F5"/>
-          </w:tcPr>
-          <w:p>
-            <w:pPr>
-              <w:spacing w:after="40" w:before="20"/>
-            </w:pPr>
-            <w:r>
-              <w:rPr>
-                <w:rFonts w:ascii="Calibri" w:hAnsi="Calibri"/>
-                <w:b w:val="0"/>
-                <w:i w:val="0"/>
-                <w:color w:val="222A2E"/>
-                <w:sz w:val="18"/>
-              </w:rPr>
-              <w:t>Scaffold Green Inspection Tag. Fall Protection Plan &amp; JSA.</w:t>
-            </w:r>
-          </w:p>
-        </w:tc>
-        <w:tc>
-          <w:tcPr>
-            <w:tcW w:type="dxa" w:w="2041"/>
-            <w:tcMar>
-              <w:top w:w="60" w:type="dxa"/>
-              <w:bottom w:w="60" w:type="dxa"/>
-              <w:start w:w="110" w:type="dxa"/>
-              <w:end w:w="110" w:type="dxa"/>
-            </w:tcMar>
-            <w:vAlign w:val="center"/>
-            <w:shd w:val="clear" w:color="auto" w:fill="EAF4F5"/>
-          </w:tcPr>
-          <w:p>
-            <w:pPr>
-              <w:spacing w:after="40" w:before="20"/>
-            </w:pPr>
-            <w:r>
-              <w:rPr>
-                <w:rFonts w:ascii="Calibri" w:hAnsi="Calibri"/>
-                <w:b w:val="0"/>
-                <w:i w:val="0"/>
-                <w:color w:val="222A2E"/>
-                <w:sz w:val="18"/>
-              </w:rPr>
-              <w:t>100% tie-off using double lanyard harnesses with shock absorbers attached to certified anchor points (&gt; 22 kN). Toe-boards and handrails installed on all working platforms.</w:t>
+              <w:t>2. Electrical Cold Work Permit</w:t>
             </w:r>
           </w:p>
         </w:tc>
@@ -2414,13 +1432,14 @@
       <w:tr>
         <w:tc>
           <w:tcPr>
-            <w:tcW w:type="dxa" w:w="1701"/>
+            <w:tcW w:type="dxa" w:w="2494"/>
             <w:tcMar>
               <w:top w:w="60" w:type="dxa"/>
               <w:bottom w:w="60" w:type="dxa"/>
               <w:start w:w="110" w:type="dxa"/>
               <w:end w:w="110" w:type="dxa"/>
             </w:tcMar>
+            <w:shd w:val="clear" w:color="auto" w:fill="DCEFF1"/>
             <w:vAlign w:val="center"/>
           </w:tcPr>
           <w:p>
@@ -2433,49 +1452,22 @@
                 <w:b/>
                 <w:i w:val="0"/>
                 <w:color w:val="003B4A"/>
-                <w:sz w:val="18"/>
+                <w:sz w:val="19"/>
               </w:rPr>
-              <w:t>9. Confined Space Entry Permit</w:t>
+              <w:t>Validity / Renewal</w:t>
             </w:r>
           </w:p>
         </w:tc>
         <w:tc>
           <w:tcPr>
-            <w:tcW w:type="dxa" w:w="1304"/>
+            <w:tcW w:type="dxa" w:w="7370"/>
             <w:tcMar>
               <w:top w:w="60" w:type="dxa"/>
               <w:bottom w:w="60" w:type="dxa"/>
               <w:start w:w="110" w:type="dxa"/>
               <w:end w:w="110" w:type="dxa"/>
             </w:tcMar>
-            <w:vAlign w:val="center"/>
-          </w:tcPr>
-          <w:p>
-            <w:pPr>
-              <w:spacing w:after="40" w:before="20"/>
-            </w:pPr>
-            <w:r>
-              <w:rPr>
-                <w:rFonts w:ascii="Calibri" w:hAnsi="Calibri"/>
-                <w:b w:val="0"/>
-                <w:i/>
-                <w:color w:val="5A6469"/>
-                <w:sz w:val="18"/>
-              </w:rPr>
-              <w:t>Daily (Must be renewed every shift)</w:t>
-            </w:r>
-          </w:p>
-        </w:tc>
-        <w:tc>
-          <w:tcPr>
-            <w:tcW w:type="dxa" w:w="2551"/>
-            <w:tcMar>
-              <w:top w:w="60" w:type="dxa"/>
-              <w:bottom w:w="60" w:type="dxa"/>
-              <w:start w:w="110" w:type="dxa"/>
-              <w:end w:w="110" w:type="dxa"/>
-            </w:tcMar>
-            <w:vAlign w:val="center"/>
+            <w:shd w:val="clear" w:color="auto" w:fill="F7FBFB"/>
           </w:tcPr>
           <w:p>
             <w:pPr>
@@ -2487,22 +1479,52 @@
                 <w:b w:val="0"/>
                 <w:i w:val="0"/>
                 <w:color w:val="222A2E"/>
-                <w:sz w:val="18"/>
+                <w:sz w:val="20"/>
               </w:rPr>
-              <w:t>Entry into tanks, pressure vessels, underground ducts/vaults, manholes or other enclosures classified as confined spaces on the basis of risk assessment and atmospheric evaluation (restricted entry/exit and actual or potential hazardous atmosphere). Excavations and trenches are governed by the Excavation &amp; Trenching Permit and are treated as confined spaces only where a specific confined-space risk assessment so determines — depth alone does not define a confined space.</w:t>
+              <w:t>Weekly (Max 7 Days with Daily Endorsement)</w:t>
             </w:r>
           </w:p>
         </w:tc>
+      </w:tr>
+      <w:tr>
         <w:tc>
           <w:tcPr>
-            <w:tcW w:type="dxa" w:w="2268"/>
+            <w:tcW w:type="dxa" w:w="2494"/>
             <w:tcMar>
               <w:top w:w="60" w:type="dxa"/>
               <w:bottom w:w="60" w:type="dxa"/>
               <w:start w:w="110" w:type="dxa"/>
               <w:end w:w="110" w:type="dxa"/>
             </w:tcMar>
+            <w:shd w:val="clear" w:color="auto" w:fill="DCEFF1"/>
             <w:vAlign w:val="center"/>
+          </w:tcPr>
+          <w:p>
+            <w:pPr>
+              <w:spacing w:after="40" w:before="20"/>
+            </w:pPr>
+            <w:r>
+              <w:rPr>
+                <w:rFonts w:ascii="Calibri" w:hAnsi="Calibri"/>
+                <w:b/>
+                <w:i w:val="0"/>
+                <w:color w:val="003B4A"/>
+                <w:sz w:val="19"/>
+              </w:rPr>
+              <w:t>Scope of Activities Covered</w:t>
+            </w:r>
+          </w:p>
+        </w:tc>
+        <w:tc>
+          <w:tcPr>
+            <w:tcW w:type="dxa" w:w="7370"/>
+            <w:tcMar>
+              <w:top w:w="60" w:type="dxa"/>
+              <w:bottom w:w="60" w:type="dxa"/>
+              <w:start w:w="110" w:type="dxa"/>
+              <w:end w:w="110" w:type="dxa"/>
+            </w:tcMar>
+            <w:shd w:val="clear" w:color="auto" w:fill="F7FBFB"/>
           </w:tcPr>
           <w:p>
             <w:pPr>
@@ -2514,22 +1536,52 @@
                 <w:b w:val="0"/>
                 <w:i w:val="0"/>
                 <w:color w:val="222A2E"/>
-                <w:sz w:val="18"/>
+                <w:sz w:val="20"/>
               </w:rPr>
-              <w:t>Approved JSA &amp; Emergency Rescue Plan. AGT Gas Test Log (O2, LEL, H2S, CO). Electrical &amp; Energy Isolation (LOTO) Certificate.</w:t>
+              <w:t>Non-energized electrical works, cable pulling, ladder tray installation, panel mounting, dead cable splicing, and general electrical installation activities (de-energized state).</w:t>
             </w:r>
           </w:p>
         </w:tc>
+      </w:tr>
+      <w:tr>
         <w:tc>
           <w:tcPr>
-            <w:tcW w:type="dxa" w:w="2041"/>
+            <w:tcW w:type="dxa" w:w="2494"/>
             <w:tcMar>
               <w:top w:w="60" w:type="dxa"/>
               <w:bottom w:w="60" w:type="dxa"/>
               <w:start w:w="110" w:type="dxa"/>
               <w:end w:w="110" w:type="dxa"/>
             </w:tcMar>
+            <w:shd w:val="clear" w:color="auto" w:fill="DCEFF1"/>
             <w:vAlign w:val="center"/>
+          </w:tcPr>
+          <w:p>
+            <w:pPr>
+              <w:spacing w:after="40" w:before="20"/>
+            </w:pPr>
+            <w:r>
+              <w:rPr>
+                <w:rFonts w:ascii="Calibri" w:hAnsi="Calibri"/>
+                <w:b/>
+                <w:i w:val="0"/>
+                <w:color w:val="003B4A"/>
+                <w:sz w:val="19"/>
+              </w:rPr>
+              <w:t>Mandatory Prerequisites &amp; Attachments</w:t>
+            </w:r>
+          </w:p>
+        </w:tc>
+        <w:tc>
+          <w:tcPr>
+            <w:tcW w:type="dxa" w:w="7370"/>
+            <w:tcMar>
+              <w:top w:w="60" w:type="dxa"/>
+              <w:bottom w:w="60" w:type="dxa"/>
+              <w:start w:w="110" w:type="dxa"/>
+              <w:end w:w="110" w:type="dxa"/>
+            </w:tcMar>
+            <w:shd w:val="clear" w:color="auto" w:fill="F7FBFB"/>
           </w:tcPr>
           <w:p>
             <w:pPr>
@@ -2541,7 +1593,1854 @@
                 <w:b w:val="0"/>
                 <w:i w:val="0"/>
                 <w:color w:val="222A2E"/>
-                <w:sz w:val="18"/>
+                <w:sz w:val="20"/>
+              </w:rPr>
+              <w:t>Approved JSA &amp; Installation Method Statement. Single-Line Diagram (SLD) / Layout Drawing. Insulated Tool Inspection Checklist.</w:t>
+            </w:r>
+          </w:p>
+        </w:tc>
+      </w:tr>
+      <w:tr>
+        <w:tc>
+          <w:tcPr>
+            <w:tcW w:type="dxa" w:w="2494"/>
+            <w:tcMar>
+              <w:top w:w="60" w:type="dxa"/>
+              <w:bottom w:w="60" w:type="dxa"/>
+              <w:start w:w="110" w:type="dxa"/>
+              <w:end w:w="110" w:type="dxa"/>
+            </w:tcMar>
+            <w:shd w:val="clear" w:color="auto" w:fill="DCEFF1"/>
+            <w:vAlign w:val="center"/>
+          </w:tcPr>
+          <w:p>
+            <w:pPr>
+              <w:spacing w:after="40" w:before="20"/>
+            </w:pPr>
+            <w:r>
+              <w:rPr>
+                <w:rFonts w:ascii="Calibri" w:hAnsi="Calibri"/>
+                <w:b/>
+                <w:i w:val="0"/>
+                <w:color w:val="003B4A"/>
+                <w:sz w:val="19"/>
+              </w:rPr>
+              <w:t>Key On-Site Control Measures</w:t>
+            </w:r>
+          </w:p>
+        </w:tc>
+        <w:tc>
+          <w:tcPr>
+            <w:tcW w:type="dxa" w:w="7370"/>
+            <w:tcMar>
+              <w:top w:w="60" w:type="dxa"/>
+              <w:bottom w:w="60" w:type="dxa"/>
+              <w:start w:w="110" w:type="dxa"/>
+              <w:end w:w="110" w:type="dxa"/>
+            </w:tcMar>
+            <w:shd w:val="clear" w:color="auto" w:fill="F7FBFB"/>
+          </w:tcPr>
+          <w:p>
+            <w:pPr>
+              <w:spacing w:after="40" w:before="20"/>
+            </w:pPr>
+            <w:r>
+              <w:rPr>
+                <w:rFonts w:ascii="Calibri" w:hAnsi="Calibri"/>
+                <w:b w:val="0"/>
+                <w:i w:val="0"/>
+                <w:color w:val="222A2E"/>
+                <w:sz w:val="20"/>
+              </w:rPr>
+              <w:t>Verification of completely de-energized system state. Calibrated insulated hand tools (1000 V rated). Barricading around active installation zones. Standard electrical PPE (safety shoes, leather gloves).</w:t>
+            </w:r>
+          </w:p>
+        </w:tc>
+      </w:tr>
+      <w:tr>
+        <w:tc>
+          <w:tcPr>
+            <w:tcW w:type="dxa" w:w="7370"/>
+            <w:gridSpan w:val="2"/>
+            <w:shd w:val="clear" w:color="auto" w:fill="007E8C"/>
+            <w:tcMar>
+              <w:top w:w="70" w:type="dxa"/>
+              <w:bottom w:w="70" w:type="dxa"/>
+              <w:start w:w="110" w:type="dxa"/>
+              <w:end w:w="110" w:type="dxa"/>
+            </w:tcMar>
+          </w:tcPr>
+          <w:p>
+            <w:pPr>
+              <w:spacing w:after="40" w:before="20"/>
+            </w:pPr>
+            <w:r>
+              <w:rPr>
+                <w:rFonts w:ascii="Calibri" w:hAnsi="Calibri"/>
+                <w:b/>
+                <w:i w:val="0"/>
+                <w:color w:val="FFFFFF"/>
+                <w:sz w:val="21"/>
+              </w:rPr>
+              <w:t>3. Electrical Hot Work &amp; Commissioning Permit</w:t>
+            </w:r>
+          </w:p>
+        </w:tc>
+      </w:tr>
+      <w:tr>
+        <w:tc>
+          <w:tcPr>
+            <w:tcW w:type="dxa" w:w="2494"/>
+            <w:tcMar>
+              <w:top w:w="60" w:type="dxa"/>
+              <w:bottom w:w="60" w:type="dxa"/>
+              <w:start w:w="110" w:type="dxa"/>
+              <w:end w:w="110" w:type="dxa"/>
+            </w:tcMar>
+            <w:shd w:val="clear" w:color="auto" w:fill="DCEFF1"/>
+            <w:vAlign w:val="center"/>
+          </w:tcPr>
+          <w:p>
+            <w:pPr>
+              <w:spacing w:after="40" w:before="20"/>
+            </w:pPr>
+            <w:r>
+              <w:rPr>
+                <w:rFonts w:ascii="Calibri" w:hAnsi="Calibri"/>
+                <w:b/>
+                <w:i w:val="0"/>
+                <w:color w:val="003B4A"/>
+                <w:sz w:val="19"/>
+              </w:rPr>
+              <w:t>Validity / Renewal</w:t>
+            </w:r>
+          </w:p>
+        </w:tc>
+        <w:tc>
+          <w:tcPr>
+            <w:tcW w:type="dxa" w:w="7370"/>
+            <w:tcMar>
+              <w:top w:w="60" w:type="dxa"/>
+              <w:bottom w:w="60" w:type="dxa"/>
+              <w:start w:w="110" w:type="dxa"/>
+              <w:end w:w="110" w:type="dxa"/>
+            </w:tcMar>
+          </w:tcPr>
+          <w:p>
+            <w:pPr>
+              <w:spacing w:after="40" w:before="20"/>
+            </w:pPr>
+            <w:r>
+              <w:rPr>
+                <w:rFonts w:ascii="Calibri" w:hAnsi="Calibri"/>
+                <w:b w:val="0"/>
+                <w:i w:val="0"/>
+                <w:color w:val="222A2E"/>
+                <w:sz w:val="20"/>
+              </w:rPr>
+              <w:t>Daily (Must be renewed every shift)</w:t>
+            </w:r>
+          </w:p>
+        </w:tc>
+      </w:tr>
+      <w:tr>
+        <w:tc>
+          <w:tcPr>
+            <w:tcW w:type="dxa" w:w="2494"/>
+            <w:tcMar>
+              <w:top w:w="60" w:type="dxa"/>
+              <w:bottom w:w="60" w:type="dxa"/>
+              <w:start w:w="110" w:type="dxa"/>
+              <w:end w:w="110" w:type="dxa"/>
+            </w:tcMar>
+            <w:shd w:val="clear" w:color="auto" w:fill="DCEFF1"/>
+            <w:vAlign w:val="center"/>
+          </w:tcPr>
+          <w:p>
+            <w:pPr>
+              <w:spacing w:after="40" w:before="20"/>
+            </w:pPr>
+            <w:r>
+              <w:rPr>
+                <w:rFonts w:ascii="Calibri" w:hAnsi="Calibri"/>
+                <w:b/>
+                <w:i w:val="0"/>
+                <w:color w:val="003B4A"/>
+                <w:sz w:val="19"/>
+              </w:rPr>
+              <w:t>Scope of Activities Covered</w:t>
+            </w:r>
+          </w:p>
+        </w:tc>
+        <w:tc>
+          <w:tcPr>
+            <w:tcW w:type="dxa" w:w="7370"/>
+            <w:tcMar>
+              <w:top w:w="60" w:type="dxa"/>
+              <w:bottom w:w="60" w:type="dxa"/>
+              <w:start w:w="110" w:type="dxa"/>
+              <w:end w:w="110" w:type="dxa"/>
+            </w:tcMar>
+          </w:tcPr>
+          <w:p>
+            <w:pPr>
+              <w:spacing w:after="40" w:before="20"/>
+            </w:pPr>
+            <w:r>
+              <w:rPr>
+                <w:rFonts w:ascii="Calibri" w:hAnsi="Calibri"/>
+                <w:b w:val="0"/>
+                <w:i w:val="0"/>
+                <w:color w:val="222A2E"/>
+                <w:sz w:val="20"/>
+              </w:rPr>
+              <w:t>Energized electrical works, commissioning activities, live testing/troubleshooting, switchgear energization, transformer testing, MCC energization, and HV/LV commissioning tasks.</w:t>
+            </w:r>
+          </w:p>
+        </w:tc>
+      </w:tr>
+      <w:tr>
+        <w:tc>
+          <w:tcPr>
+            <w:tcW w:type="dxa" w:w="2494"/>
+            <w:tcMar>
+              <w:top w:w="60" w:type="dxa"/>
+              <w:bottom w:w="60" w:type="dxa"/>
+              <w:start w:w="110" w:type="dxa"/>
+              <w:end w:w="110" w:type="dxa"/>
+            </w:tcMar>
+            <w:shd w:val="clear" w:color="auto" w:fill="DCEFF1"/>
+            <w:vAlign w:val="center"/>
+          </w:tcPr>
+          <w:p>
+            <w:pPr>
+              <w:spacing w:after="40" w:before="20"/>
+            </w:pPr>
+            <w:r>
+              <w:rPr>
+                <w:rFonts w:ascii="Calibri" w:hAnsi="Calibri"/>
+                <w:b/>
+                <w:i w:val="0"/>
+                <w:color w:val="003B4A"/>
+                <w:sz w:val="19"/>
+              </w:rPr>
+              <w:t>Mandatory Prerequisites &amp; Attachments</w:t>
+            </w:r>
+          </w:p>
+        </w:tc>
+        <w:tc>
+          <w:tcPr>
+            <w:tcW w:type="dxa" w:w="7370"/>
+            <w:tcMar>
+              <w:top w:w="60" w:type="dxa"/>
+              <w:bottom w:w="60" w:type="dxa"/>
+              <w:start w:w="110" w:type="dxa"/>
+              <w:end w:w="110" w:type="dxa"/>
+            </w:tcMar>
+          </w:tcPr>
+          <w:p>
+            <w:pPr>
+              <w:spacing w:after="40" w:before="20"/>
+            </w:pPr>
+            <w:r>
+              <w:rPr>
+                <w:rFonts w:ascii="Calibri" w:hAnsi="Calibri"/>
+                <w:b w:val="0"/>
+                <w:i w:val="0"/>
+                <w:color w:val="222A2E"/>
+                <w:sz w:val="20"/>
+              </w:rPr>
+              <w:t>Approved JSA &amp; Commissioning Method Statement. SLD / Energization Plan. Arc Flash Risk Assessment &amp; Boundary Calculation. AEP Authorization Certificate.</w:t>
+            </w:r>
+          </w:p>
+        </w:tc>
+      </w:tr>
+      <w:tr>
+        <w:tc>
+          <w:tcPr>
+            <w:tcW w:type="dxa" w:w="2494"/>
+            <w:tcMar>
+              <w:top w:w="60" w:type="dxa"/>
+              <w:bottom w:w="60" w:type="dxa"/>
+              <w:start w:w="110" w:type="dxa"/>
+              <w:end w:w="110" w:type="dxa"/>
+            </w:tcMar>
+            <w:shd w:val="clear" w:color="auto" w:fill="DCEFF1"/>
+            <w:vAlign w:val="center"/>
+          </w:tcPr>
+          <w:p>
+            <w:pPr>
+              <w:spacing w:after="40" w:before="20"/>
+            </w:pPr>
+            <w:r>
+              <w:rPr>
+                <w:rFonts w:ascii="Calibri" w:hAnsi="Calibri"/>
+                <w:b/>
+                <w:i w:val="0"/>
+                <w:color w:val="003B4A"/>
+                <w:sz w:val="19"/>
+              </w:rPr>
+              <w:t>Key On-Site Control Measures</w:t>
+            </w:r>
+          </w:p>
+        </w:tc>
+        <w:tc>
+          <w:tcPr>
+            <w:tcW w:type="dxa" w:w="7370"/>
+            <w:tcMar>
+              <w:top w:w="60" w:type="dxa"/>
+              <w:bottom w:w="60" w:type="dxa"/>
+              <w:start w:w="110" w:type="dxa"/>
+              <w:end w:w="110" w:type="dxa"/>
+            </w:tcMar>
+          </w:tcPr>
+          <w:p>
+            <w:pPr>
+              <w:spacing w:after="40" w:before="20"/>
+            </w:pPr>
+            <w:r>
+              <w:rPr>
+                <w:rFonts w:ascii="Calibri" w:hAnsi="Calibri"/>
+                <w:b w:val="0"/>
+                <w:i w:val="0"/>
+                <w:color w:val="222A2E"/>
+                <w:sz w:val="20"/>
+              </w:rPr>
+              <w:t>Arc Flash PPE Category 2/4 (face shield, flame-resistant suit/hood). Calibrated voltage detectors &amp; insulated tools. Dielectric insulating rubber mats at panel front. AEP supervision on-site. Barricading with Arc Flash warning signage.</w:t>
+            </w:r>
+          </w:p>
+        </w:tc>
+      </w:tr>
+      <w:tr>
+        <w:tc>
+          <w:tcPr>
+            <w:tcW w:type="dxa" w:w="7370"/>
+            <w:gridSpan w:val="2"/>
+            <w:shd w:val="clear" w:color="auto" w:fill="007E8C"/>
+            <w:tcMar>
+              <w:top w:w="70" w:type="dxa"/>
+              <w:bottom w:w="70" w:type="dxa"/>
+              <w:start w:w="110" w:type="dxa"/>
+              <w:end w:w="110" w:type="dxa"/>
+            </w:tcMar>
+          </w:tcPr>
+          <w:p>
+            <w:pPr>
+              <w:spacing w:after="40" w:before="20"/>
+            </w:pPr>
+            <w:r>
+              <w:rPr>
+                <w:rFonts w:ascii="Calibri" w:hAnsi="Calibri"/>
+                <w:b/>
+                <w:i w:val="0"/>
+                <w:color w:val="FFFFFF"/>
+                <w:sz w:val="21"/>
+              </w:rPr>
+              <w:t>4. Energy Isolation (LOTO) Permit</w:t>
+            </w:r>
+          </w:p>
+        </w:tc>
+      </w:tr>
+      <w:tr>
+        <w:tc>
+          <w:tcPr>
+            <w:tcW w:type="dxa" w:w="2494"/>
+            <w:tcMar>
+              <w:top w:w="60" w:type="dxa"/>
+              <w:bottom w:w="60" w:type="dxa"/>
+              <w:start w:w="110" w:type="dxa"/>
+              <w:end w:w="110" w:type="dxa"/>
+            </w:tcMar>
+            <w:shd w:val="clear" w:color="auto" w:fill="DCEFF1"/>
+            <w:vAlign w:val="center"/>
+          </w:tcPr>
+          <w:p>
+            <w:pPr>
+              <w:spacing w:after="40" w:before="20"/>
+            </w:pPr>
+            <w:r>
+              <w:rPr>
+                <w:rFonts w:ascii="Calibri" w:hAnsi="Calibri"/>
+                <w:b/>
+                <w:i w:val="0"/>
+                <w:color w:val="003B4A"/>
+                <w:sz w:val="19"/>
+              </w:rPr>
+              <w:t>Validity / Renewal</w:t>
+            </w:r>
+          </w:p>
+        </w:tc>
+        <w:tc>
+          <w:tcPr>
+            <w:tcW w:type="dxa" w:w="7370"/>
+            <w:tcMar>
+              <w:top w:w="60" w:type="dxa"/>
+              <w:bottom w:w="60" w:type="dxa"/>
+              <w:start w:w="110" w:type="dxa"/>
+              <w:end w:w="110" w:type="dxa"/>
+            </w:tcMar>
+            <w:shd w:val="clear" w:color="auto" w:fill="F7FBFB"/>
+          </w:tcPr>
+          <w:p>
+            <w:pPr>
+              <w:spacing w:after="40" w:before="20"/>
+            </w:pPr>
+            <w:r>
+              <w:rPr>
+                <w:rFonts w:ascii="Calibri" w:hAnsi="Calibri"/>
+                <w:b w:val="0"/>
+                <w:i w:val="0"/>
+                <w:color w:val="222A2E"/>
+                <w:sz w:val="20"/>
+              </w:rPr>
+              <w:t>Daily (Must be renewed every shift)</w:t>
+            </w:r>
+          </w:p>
+        </w:tc>
+      </w:tr>
+      <w:tr>
+        <w:tc>
+          <w:tcPr>
+            <w:tcW w:type="dxa" w:w="2494"/>
+            <w:tcMar>
+              <w:top w:w="60" w:type="dxa"/>
+              <w:bottom w:w="60" w:type="dxa"/>
+              <w:start w:w="110" w:type="dxa"/>
+              <w:end w:w="110" w:type="dxa"/>
+            </w:tcMar>
+            <w:shd w:val="clear" w:color="auto" w:fill="DCEFF1"/>
+            <w:vAlign w:val="center"/>
+          </w:tcPr>
+          <w:p>
+            <w:pPr>
+              <w:spacing w:after="40" w:before="20"/>
+            </w:pPr>
+            <w:r>
+              <w:rPr>
+                <w:rFonts w:ascii="Calibri" w:hAnsi="Calibri"/>
+                <w:b/>
+                <w:i w:val="0"/>
+                <w:color w:val="003B4A"/>
+                <w:sz w:val="19"/>
+              </w:rPr>
+              <w:t>Scope of Activities Covered</w:t>
+            </w:r>
+          </w:p>
+        </w:tc>
+        <w:tc>
+          <w:tcPr>
+            <w:tcW w:type="dxa" w:w="7370"/>
+            <w:tcMar>
+              <w:top w:w="60" w:type="dxa"/>
+              <w:bottom w:w="60" w:type="dxa"/>
+              <w:start w:w="110" w:type="dxa"/>
+              <w:end w:w="110" w:type="dxa"/>
+            </w:tcMar>
+            <w:shd w:val="clear" w:color="auto" w:fill="F7FBFB"/>
+          </w:tcPr>
+          <w:p>
+            <w:pPr>
+              <w:spacing w:after="40" w:before="20"/>
+            </w:pPr>
+            <w:r>
+              <w:rPr>
+                <w:rFonts w:ascii="Calibri" w:hAnsi="Calibri"/>
+                <w:b w:val="0"/>
+                <w:i w:val="0"/>
+                <w:color w:val="222A2E"/>
+                <w:sz w:val="20"/>
+              </w:rPr>
+              <w:t>All mechanical, pneumatic, hydraulic, thermal, and electrical energy isolations associated with maintenance or commissioning activities. LOTO validity is managed separately from PTW validity: isolations remain under Isolation Authority control until formal de-isolation, regardless of permit expiry/renewal.</w:t>
+            </w:r>
+          </w:p>
+        </w:tc>
+      </w:tr>
+      <w:tr>
+        <w:tc>
+          <w:tcPr>
+            <w:tcW w:type="dxa" w:w="2494"/>
+            <w:tcMar>
+              <w:top w:w="60" w:type="dxa"/>
+              <w:bottom w:w="60" w:type="dxa"/>
+              <w:start w:w="110" w:type="dxa"/>
+              <w:end w:w="110" w:type="dxa"/>
+            </w:tcMar>
+            <w:shd w:val="clear" w:color="auto" w:fill="DCEFF1"/>
+            <w:vAlign w:val="center"/>
+          </w:tcPr>
+          <w:p>
+            <w:pPr>
+              <w:spacing w:after="40" w:before="20"/>
+            </w:pPr>
+            <w:r>
+              <w:rPr>
+                <w:rFonts w:ascii="Calibri" w:hAnsi="Calibri"/>
+                <w:b/>
+                <w:i w:val="0"/>
+                <w:color w:val="003B4A"/>
+                <w:sz w:val="19"/>
+              </w:rPr>
+              <w:t>Mandatory Prerequisites &amp; Attachments</w:t>
+            </w:r>
+          </w:p>
+        </w:tc>
+        <w:tc>
+          <w:tcPr>
+            <w:tcW w:type="dxa" w:w="7370"/>
+            <w:tcMar>
+              <w:top w:w="60" w:type="dxa"/>
+              <w:bottom w:w="60" w:type="dxa"/>
+              <w:start w:w="110" w:type="dxa"/>
+              <w:end w:w="110" w:type="dxa"/>
+            </w:tcMar>
+            <w:shd w:val="clear" w:color="auto" w:fill="F7FBFB"/>
+          </w:tcPr>
+          <w:p>
+            <w:pPr>
+              <w:spacing w:after="40" w:before="20"/>
+            </w:pPr>
+            <w:r>
+              <w:rPr>
+                <w:rFonts w:ascii="Calibri" w:hAnsi="Calibri"/>
+                <w:b w:val="0"/>
+                <w:i w:val="0"/>
+                <w:color w:val="222A2E"/>
+                <w:sz w:val="20"/>
+              </w:rPr>
+              <w:t>Approved JSA &amp; Isolation Plan. P&amp;ID / SLD Isolation Drawing. LOTO Key Register &amp; Isolation Certificate.</w:t>
+            </w:r>
+          </w:p>
+        </w:tc>
+      </w:tr>
+      <w:tr>
+        <w:tc>
+          <w:tcPr>
+            <w:tcW w:type="dxa" w:w="2494"/>
+            <w:tcMar>
+              <w:top w:w="60" w:type="dxa"/>
+              <w:bottom w:w="60" w:type="dxa"/>
+              <w:start w:w="110" w:type="dxa"/>
+              <w:end w:w="110" w:type="dxa"/>
+            </w:tcMar>
+            <w:shd w:val="clear" w:color="auto" w:fill="DCEFF1"/>
+            <w:vAlign w:val="center"/>
+          </w:tcPr>
+          <w:p>
+            <w:pPr>
+              <w:spacing w:after="40" w:before="20"/>
+            </w:pPr>
+            <w:r>
+              <w:rPr>
+                <w:rFonts w:ascii="Calibri" w:hAnsi="Calibri"/>
+                <w:b/>
+                <w:i w:val="0"/>
+                <w:color w:val="003B4A"/>
+                <w:sz w:val="19"/>
+              </w:rPr>
+              <w:t>Key On-Site Control Measures</w:t>
+            </w:r>
+          </w:p>
+        </w:tc>
+        <w:tc>
+          <w:tcPr>
+            <w:tcW w:type="dxa" w:w="7370"/>
+            <w:tcMar>
+              <w:top w:w="60" w:type="dxa"/>
+              <w:bottom w:w="60" w:type="dxa"/>
+              <w:start w:w="110" w:type="dxa"/>
+              <w:end w:w="110" w:type="dxa"/>
+            </w:tcMar>
+            <w:shd w:val="clear" w:color="auto" w:fill="F7FBFB"/>
+          </w:tcPr>
+          <w:p>
+            <w:pPr>
+              <w:spacing w:after="40" w:before="20"/>
+            </w:pPr>
+            <w:r>
+              <w:rPr>
+                <w:rFonts w:ascii="Calibri" w:hAnsi="Calibri"/>
+                <w:b w:val="0"/>
+                <w:i w:val="0"/>
+                <w:color w:val="222A2E"/>
+                <w:sz w:val="20"/>
+              </w:rPr>
+              <w:t>Physical padlocks, hasps, and “DO NOT OPERATE” tags applied. Zero Energy State verification test (voltage check, depressurization). Lockbox key containment under AEP control.</w:t>
+            </w:r>
+          </w:p>
+        </w:tc>
+      </w:tr>
+      <w:tr>
+        <w:tc>
+          <w:tcPr>
+            <w:tcW w:type="dxa" w:w="7370"/>
+            <w:gridSpan w:val="2"/>
+            <w:shd w:val="clear" w:color="auto" w:fill="007E8C"/>
+            <w:tcMar>
+              <w:top w:w="70" w:type="dxa"/>
+              <w:bottom w:w="70" w:type="dxa"/>
+              <w:start w:w="110" w:type="dxa"/>
+              <w:end w:w="110" w:type="dxa"/>
+            </w:tcMar>
+          </w:tcPr>
+          <w:p>
+            <w:pPr>
+              <w:spacing w:after="40" w:before="20"/>
+            </w:pPr>
+            <w:r>
+              <w:rPr>
+                <w:rFonts w:ascii="Calibri" w:hAnsi="Calibri"/>
+                <w:b/>
+                <w:i w:val="0"/>
+                <w:color w:val="FFFFFF"/>
+                <w:sz w:val="21"/>
+              </w:rPr>
+              <w:t>5. Hot Work Permit (Thermal / Open Flame)</w:t>
+            </w:r>
+          </w:p>
+        </w:tc>
+      </w:tr>
+      <w:tr>
+        <w:tc>
+          <w:tcPr>
+            <w:tcW w:type="dxa" w:w="2494"/>
+            <w:tcMar>
+              <w:top w:w="60" w:type="dxa"/>
+              <w:bottom w:w="60" w:type="dxa"/>
+              <w:start w:w="110" w:type="dxa"/>
+              <w:end w:w="110" w:type="dxa"/>
+            </w:tcMar>
+            <w:shd w:val="clear" w:color="auto" w:fill="DCEFF1"/>
+            <w:vAlign w:val="center"/>
+          </w:tcPr>
+          <w:p>
+            <w:pPr>
+              <w:spacing w:after="40" w:before="20"/>
+            </w:pPr>
+            <w:r>
+              <w:rPr>
+                <w:rFonts w:ascii="Calibri" w:hAnsi="Calibri"/>
+                <w:b/>
+                <w:i w:val="0"/>
+                <w:color w:val="003B4A"/>
+                <w:sz w:val="19"/>
+              </w:rPr>
+              <w:t>Validity / Renewal</w:t>
+            </w:r>
+          </w:p>
+        </w:tc>
+        <w:tc>
+          <w:tcPr>
+            <w:tcW w:type="dxa" w:w="7370"/>
+            <w:tcMar>
+              <w:top w:w="60" w:type="dxa"/>
+              <w:bottom w:w="60" w:type="dxa"/>
+              <w:start w:w="110" w:type="dxa"/>
+              <w:end w:w="110" w:type="dxa"/>
+            </w:tcMar>
+          </w:tcPr>
+          <w:p>
+            <w:pPr>
+              <w:spacing w:after="40" w:before="20"/>
+            </w:pPr>
+            <w:r>
+              <w:rPr>
+                <w:rFonts w:ascii="Calibri" w:hAnsi="Calibri"/>
+                <w:b w:val="0"/>
+                <w:i w:val="0"/>
+                <w:color w:val="222A2E"/>
+                <w:sz w:val="20"/>
+              </w:rPr>
+              <w:t>Daily (Must be renewed every shift)</w:t>
+            </w:r>
+          </w:p>
+        </w:tc>
+      </w:tr>
+      <w:tr>
+        <w:tc>
+          <w:tcPr>
+            <w:tcW w:type="dxa" w:w="2494"/>
+            <w:tcMar>
+              <w:top w:w="60" w:type="dxa"/>
+              <w:bottom w:w="60" w:type="dxa"/>
+              <w:start w:w="110" w:type="dxa"/>
+              <w:end w:w="110" w:type="dxa"/>
+            </w:tcMar>
+            <w:shd w:val="clear" w:color="auto" w:fill="DCEFF1"/>
+            <w:vAlign w:val="center"/>
+          </w:tcPr>
+          <w:p>
+            <w:pPr>
+              <w:spacing w:after="40" w:before="20"/>
+            </w:pPr>
+            <w:r>
+              <w:rPr>
+                <w:rFonts w:ascii="Calibri" w:hAnsi="Calibri"/>
+                <w:b/>
+                <w:i w:val="0"/>
+                <w:color w:val="003B4A"/>
+                <w:sz w:val="19"/>
+              </w:rPr>
+              <w:t>Scope of Activities Covered</w:t>
+            </w:r>
+          </w:p>
+        </w:tc>
+        <w:tc>
+          <w:tcPr>
+            <w:tcW w:type="dxa" w:w="7370"/>
+            <w:tcMar>
+              <w:top w:w="60" w:type="dxa"/>
+              <w:bottom w:w="60" w:type="dxa"/>
+              <w:start w:w="110" w:type="dxa"/>
+              <w:end w:w="110" w:type="dxa"/>
+            </w:tcMar>
+          </w:tcPr>
+          <w:p>
+            <w:pPr>
+              <w:spacing w:after="40" w:before="20"/>
+            </w:pPr>
+            <w:r>
+              <w:rPr>
+                <w:rFonts w:ascii="Calibri" w:hAnsi="Calibri"/>
+                <w:b w:val="0"/>
+                <w:i w:val="0"/>
+                <w:color w:val="222A2E"/>
+                <w:sz w:val="20"/>
+              </w:rPr>
+              <w:t>Welding, flame cutting, grinding, soldering, thermal spraying, or any activity producing sparks, open flames, or heat above 100°C.</w:t>
+            </w:r>
+          </w:p>
+        </w:tc>
+      </w:tr>
+      <w:tr>
+        <w:tc>
+          <w:tcPr>
+            <w:tcW w:type="dxa" w:w="2494"/>
+            <w:tcMar>
+              <w:top w:w="60" w:type="dxa"/>
+              <w:bottom w:w="60" w:type="dxa"/>
+              <w:start w:w="110" w:type="dxa"/>
+              <w:end w:w="110" w:type="dxa"/>
+            </w:tcMar>
+            <w:shd w:val="clear" w:color="auto" w:fill="DCEFF1"/>
+            <w:vAlign w:val="center"/>
+          </w:tcPr>
+          <w:p>
+            <w:pPr>
+              <w:spacing w:after="40" w:before="20"/>
+            </w:pPr>
+            <w:r>
+              <w:rPr>
+                <w:rFonts w:ascii="Calibri" w:hAnsi="Calibri"/>
+                <w:b/>
+                <w:i w:val="0"/>
+                <w:color w:val="003B4A"/>
+                <w:sz w:val="19"/>
+              </w:rPr>
+              <w:t>Mandatory Prerequisites &amp; Attachments</w:t>
+            </w:r>
+          </w:p>
+        </w:tc>
+        <w:tc>
+          <w:tcPr>
+            <w:tcW w:type="dxa" w:w="7370"/>
+            <w:tcMar>
+              <w:top w:w="60" w:type="dxa"/>
+              <w:bottom w:w="60" w:type="dxa"/>
+              <w:start w:w="110" w:type="dxa"/>
+              <w:end w:w="110" w:type="dxa"/>
+            </w:tcMar>
+          </w:tcPr>
+          <w:p>
+            <w:pPr>
+              <w:spacing w:after="40" w:before="20"/>
+            </w:pPr>
+            <w:r>
+              <w:rPr>
+                <w:rFonts w:ascii="Calibri" w:hAnsi="Calibri"/>
+                <w:b w:val="0"/>
+                <w:i w:val="0"/>
+                <w:color w:val="222A2E"/>
+                <w:sz w:val="20"/>
+              </w:rPr>
+              <w:t>Approved JSA. Fire Watch appointment form. Gas Test certificate (if near fuel/chemical zones).</w:t>
+            </w:r>
+          </w:p>
+        </w:tc>
+      </w:tr>
+      <w:tr>
+        <w:tc>
+          <w:tcPr>
+            <w:tcW w:type="dxa" w:w="2494"/>
+            <w:tcMar>
+              <w:top w:w="60" w:type="dxa"/>
+              <w:bottom w:w="60" w:type="dxa"/>
+              <w:start w:w="110" w:type="dxa"/>
+              <w:end w:w="110" w:type="dxa"/>
+            </w:tcMar>
+            <w:shd w:val="clear" w:color="auto" w:fill="DCEFF1"/>
+            <w:vAlign w:val="center"/>
+          </w:tcPr>
+          <w:p>
+            <w:pPr>
+              <w:spacing w:after="40" w:before="20"/>
+            </w:pPr>
+            <w:r>
+              <w:rPr>
+                <w:rFonts w:ascii="Calibri" w:hAnsi="Calibri"/>
+                <w:b/>
+                <w:i w:val="0"/>
+                <w:color w:val="003B4A"/>
+                <w:sz w:val="19"/>
+              </w:rPr>
+              <w:t>Key On-Site Control Measures</w:t>
+            </w:r>
+          </w:p>
+        </w:tc>
+        <w:tc>
+          <w:tcPr>
+            <w:tcW w:type="dxa" w:w="7370"/>
+            <w:tcMar>
+              <w:top w:w="60" w:type="dxa"/>
+              <w:bottom w:w="60" w:type="dxa"/>
+              <w:start w:w="110" w:type="dxa"/>
+              <w:end w:w="110" w:type="dxa"/>
+            </w:tcMar>
+          </w:tcPr>
+          <w:p>
+            <w:pPr>
+              <w:spacing w:after="40" w:before="20"/>
+            </w:pPr>
+            <w:r>
+              <w:rPr>
+                <w:rFonts w:ascii="Calibri" w:hAnsi="Calibri"/>
+                <w:b w:val="0"/>
+                <w:i w:val="0"/>
+                <w:color w:val="222A2E"/>
+                <w:sz w:val="20"/>
+              </w:rPr>
+              <w:t>Fire blanket containment &amp; 10 m combustible clearance. Dedicated Fire Watch during work + 30 min post-work. Min. 2× 10 kg Dry Chemical Powder / CO2 extinguishers at site.</w:t>
+            </w:r>
+          </w:p>
+        </w:tc>
+      </w:tr>
+      <w:tr>
+        <w:tc>
+          <w:tcPr>
+            <w:tcW w:type="dxa" w:w="7370"/>
+            <w:gridSpan w:val="2"/>
+            <w:shd w:val="clear" w:color="auto" w:fill="007E8C"/>
+            <w:tcMar>
+              <w:top w:w="70" w:type="dxa"/>
+              <w:bottom w:w="70" w:type="dxa"/>
+              <w:start w:w="110" w:type="dxa"/>
+              <w:end w:w="110" w:type="dxa"/>
+            </w:tcMar>
+          </w:tcPr>
+          <w:p>
+            <w:pPr>
+              <w:spacing w:after="40" w:before="20"/>
+            </w:pPr>
+            <w:r>
+              <w:rPr>
+                <w:rFonts w:ascii="Calibri" w:hAnsi="Calibri"/>
+                <w:b/>
+                <w:i w:val="0"/>
+                <w:color w:val="FFFFFF"/>
+                <w:sz w:val="21"/>
+              </w:rPr>
+              <w:t>6. Excavation &amp; Trenching Permit</w:t>
+            </w:r>
+          </w:p>
+        </w:tc>
+      </w:tr>
+      <w:tr>
+        <w:tc>
+          <w:tcPr>
+            <w:tcW w:type="dxa" w:w="2494"/>
+            <w:tcMar>
+              <w:top w:w="60" w:type="dxa"/>
+              <w:bottom w:w="60" w:type="dxa"/>
+              <w:start w:w="110" w:type="dxa"/>
+              <w:end w:w="110" w:type="dxa"/>
+            </w:tcMar>
+            <w:shd w:val="clear" w:color="auto" w:fill="DCEFF1"/>
+            <w:vAlign w:val="center"/>
+          </w:tcPr>
+          <w:p>
+            <w:pPr>
+              <w:spacing w:after="40" w:before="20"/>
+            </w:pPr>
+            <w:r>
+              <w:rPr>
+                <w:rFonts w:ascii="Calibri" w:hAnsi="Calibri"/>
+                <w:b/>
+                <w:i w:val="0"/>
+                <w:color w:val="003B4A"/>
+                <w:sz w:val="19"/>
+              </w:rPr>
+              <w:t>Validity / Renewal</w:t>
+            </w:r>
+          </w:p>
+        </w:tc>
+        <w:tc>
+          <w:tcPr>
+            <w:tcW w:type="dxa" w:w="7370"/>
+            <w:tcMar>
+              <w:top w:w="60" w:type="dxa"/>
+              <w:bottom w:w="60" w:type="dxa"/>
+              <w:start w:w="110" w:type="dxa"/>
+              <w:end w:w="110" w:type="dxa"/>
+            </w:tcMar>
+            <w:shd w:val="clear" w:color="auto" w:fill="F7FBFB"/>
+          </w:tcPr>
+          <w:p>
+            <w:pPr>
+              <w:spacing w:after="40" w:before="20"/>
+            </w:pPr>
+            <w:r>
+              <w:rPr>
+                <w:rFonts w:ascii="Calibri" w:hAnsi="Calibri"/>
+                <w:b w:val="0"/>
+                <w:i w:val="0"/>
+                <w:color w:val="222A2E"/>
+                <w:sz w:val="20"/>
+              </w:rPr>
+              <w:t>Weekly (Max 7 Days with Daily Endorsement)</w:t>
+            </w:r>
+          </w:p>
+        </w:tc>
+      </w:tr>
+      <w:tr>
+        <w:tc>
+          <w:tcPr>
+            <w:tcW w:type="dxa" w:w="2494"/>
+            <w:tcMar>
+              <w:top w:w="60" w:type="dxa"/>
+              <w:bottom w:w="60" w:type="dxa"/>
+              <w:start w:w="110" w:type="dxa"/>
+              <w:end w:w="110" w:type="dxa"/>
+            </w:tcMar>
+            <w:shd w:val="clear" w:color="auto" w:fill="DCEFF1"/>
+            <w:vAlign w:val="center"/>
+          </w:tcPr>
+          <w:p>
+            <w:pPr>
+              <w:spacing w:after="40" w:before="20"/>
+            </w:pPr>
+            <w:r>
+              <w:rPr>
+                <w:rFonts w:ascii="Calibri" w:hAnsi="Calibri"/>
+                <w:b/>
+                <w:i w:val="0"/>
+                <w:color w:val="003B4A"/>
+                <w:sz w:val="19"/>
+              </w:rPr>
+              <w:t>Scope of Activities Covered</w:t>
+            </w:r>
+          </w:p>
+        </w:tc>
+        <w:tc>
+          <w:tcPr>
+            <w:tcW w:type="dxa" w:w="7370"/>
+            <w:tcMar>
+              <w:top w:w="60" w:type="dxa"/>
+              <w:bottom w:w="60" w:type="dxa"/>
+              <w:start w:w="110" w:type="dxa"/>
+              <w:end w:w="110" w:type="dxa"/>
+            </w:tcMar>
+            <w:shd w:val="clear" w:color="auto" w:fill="F7FBFB"/>
+          </w:tcPr>
+          <w:p>
+            <w:pPr>
+              <w:spacing w:after="40" w:before="20"/>
+            </w:pPr>
+            <w:r>
+              <w:rPr>
+                <w:rFonts w:ascii="Calibri" w:hAnsi="Calibri"/>
+                <w:b w:val="0"/>
+                <w:i w:val="0"/>
+                <w:color w:val="222A2E"/>
+                <w:sz w:val="20"/>
+              </w:rPr>
+              <w:t>Manual or mechanical digging, trenching, piling, or ground penetration exceeding 30 cm depth.</w:t>
+            </w:r>
+          </w:p>
+        </w:tc>
+      </w:tr>
+      <w:tr>
+        <w:tc>
+          <w:tcPr>
+            <w:tcW w:type="dxa" w:w="2494"/>
+            <w:tcMar>
+              <w:top w:w="60" w:type="dxa"/>
+              <w:bottom w:w="60" w:type="dxa"/>
+              <w:start w:w="110" w:type="dxa"/>
+              <w:end w:w="110" w:type="dxa"/>
+            </w:tcMar>
+            <w:shd w:val="clear" w:color="auto" w:fill="DCEFF1"/>
+            <w:vAlign w:val="center"/>
+          </w:tcPr>
+          <w:p>
+            <w:pPr>
+              <w:spacing w:after="40" w:before="20"/>
+            </w:pPr>
+            <w:r>
+              <w:rPr>
+                <w:rFonts w:ascii="Calibri" w:hAnsi="Calibri"/>
+                <w:b/>
+                <w:i w:val="0"/>
+                <w:color w:val="003B4A"/>
+                <w:sz w:val="19"/>
+              </w:rPr>
+              <w:t>Mandatory Prerequisites &amp; Attachments</w:t>
+            </w:r>
+          </w:p>
+        </w:tc>
+        <w:tc>
+          <w:tcPr>
+            <w:tcW w:type="dxa" w:w="7370"/>
+            <w:tcMar>
+              <w:top w:w="60" w:type="dxa"/>
+              <w:bottom w:w="60" w:type="dxa"/>
+              <w:start w:w="110" w:type="dxa"/>
+              <w:end w:w="110" w:type="dxa"/>
+            </w:tcMar>
+            <w:shd w:val="clear" w:color="auto" w:fill="F7FBFB"/>
+          </w:tcPr>
+          <w:p>
+            <w:pPr>
+              <w:spacing w:after="40" w:before="20"/>
+            </w:pPr>
+            <w:r>
+              <w:rPr>
+                <w:rFonts w:ascii="Calibri" w:hAnsi="Calibri"/>
+                <w:b w:val="0"/>
+                <w:i w:val="0"/>
+                <w:color w:val="222A2E"/>
+                <w:sz w:val="20"/>
+              </w:rPr>
+              <w:t>Underground Utility Clearance Map (signed by Electrical/Instrumentation). Approved JSA &amp; Soil Classification.</w:t>
+            </w:r>
+          </w:p>
+        </w:tc>
+      </w:tr>
+      <w:tr>
+        <w:tc>
+          <w:tcPr>
+            <w:tcW w:type="dxa" w:w="2494"/>
+            <w:tcMar>
+              <w:top w:w="60" w:type="dxa"/>
+              <w:bottom w:w="60" w:type="dxa"/>
+              <w:start w:w="110" w:type="dxa"/>
+              <w:end w:w="110" w:type="dxa"/>
+            </w:tcMar>
+            <w:shd w:val="clear" w:color="auto" w:fill="DCEFF1"/>
+            <w:vAlign w:val="center"/>
+          </w:tcPr>
+          <w:p>
+            <w:pPr>
+              <w:spacing w:after="40" w:before="20"/>
+            </w:pPr>
+            <w:r>
+              <w:rPr>
+                <w:rFonts w:ascii="Calibri" w:hAnsi="Calibri"/>
+                <w:b/>
+                <w:i w:val="0"/>
+                <w:color w:val="003B4A"/>
+                <w:sz w:val="19"/>
+              </w:rPr>
+              <w:t>Key On-Site Control Measures</w:t>
+            </w:r>
+          </w:p>
+        </w:tc>
+        <w:tc>
+          <w:tcPr>
+            <w:tcW w:type="dxa" w:w="7370"/>
+            <w:tcMar>
+              <w:top w:w="60" w:type="dxa"/>
+              <w:bottom w:w="60" w:type="dxa"/>
+              <w:start w:w="110" w:type="dxa"/>
+              <w:end w:w="110" w:type="dxa"/>
+            </w:tcMar>
+            <w:shd w:val="clear" w:color="auto" w:fill="F7FBFB"/>
+          </w:tcPr>
+          <w:p>
+            <w:pPr>
+              <w:spacing w:after="40" w:before="20"/>
+            </w:pPr>
+            <w:r>
+              <w:rPr>
+                <w:rFonts w:ascii="Calibri" w:hAnsi="Calibri"/>
+                <w:b w:val="0"/>
+                <w:i w:val="0"/>
+                <w:color w:val="222A2E"/>
+                <w:sz w:val="20"/>
+              </w:rPr>
+              <w:t>Shoring, benching, or sloped walls for excavations &gt; 1.2 m. Ladders positioned every 7.5 m for emergency egress. Spoil heaps set back at least 1.0 m from trench edge.</w:t>
+            </w:r>
+          </w:p>
+        </w:tc>
+      </w:tr>
+      <w:tr>
+        <w:tc>
+          <w:tcPr>
+            <w:tcW w:type="dxa" w:w="7370"/>
+            <w:gridSpan w:val="2"/>
+            <w:shd w:val="clear" w:color="auto" w:fill="007E8C"/>
+            <w:tcMar>
+              <w:top w:w="70" w:type="dxa"/>
+              <w:bottom w:w="70" w:type="dxa"/>
+              <w:start w:w="110" w:type="dxa"/>
+              <w:end w:w="110" w:type="dxa"/>
+            </w:tcMar>
+          </w:tcPr>
+          <w:p>
+            <w:pPr>
+              <w:spacing w:after="40" w:before="20"/>
+            </w:pPr>
+            <w:r>
+              <w:rPr>
+                <w:rFonts w:ascii="Calibri" w:hAnsi="Calibri"/>
+                <w:b/>
+                <w:i w:val="0"/>
+                <w:color w:val="FFFFFF"/>
+                <w:sz w:val="21"/>
+              </w:rPr>
+              <w:t>7. Lifting Permit (Mandatory Lifting Plan)</w:t>
+            </w:r>
+          </w:p>
+        </w:tc>
+      </w:tr>
+      <w:tr>
+        <w:tc>
+          <w:tcPr>
+            <w:tcW w:type="dxa" w:w="2494"/>
+            <w:tcMar>
+              <w:top w:w="60" w:type="dxa"/>
+              <w:bottom w:w="60" w:type="dxa"/>
+              <w:start w:w="110" w:type="dxa"/>
+              <w:end w:w="110" w:type="dxa"/>
+            </w:tcMar>
+            <w:shd w:val="clear" w:color="auto" w:fill="DCEFF1"/>
+            <w:vAlign w:val="center"/>
+          </w:tcPr>
+          <w:p>
+            <w:pPr>
+              <w:spacing w:after="40" w:before="20"/>
+            </w:pPr>
+            <w:r>
+              <w:rPr>
+                <w:rFonts w:ascii="Calibri" w:hAnsi="Calibri"/>
+                <w:b/>
+                <w:i w:val="0"/>
+                <w:color w:val="003B4A"/>
+                <w:sz w:val="19"/>
+              </w:rPr>
+              <w:t>Validity / Renewal</w:t>
+            </w:r>
+          </w:p>
+        </w:tc>
+        <w:tc>
+          <w:tcPr>
+            <w:tcW w:type="dxa" w:w="7370"/>
+            <w:tcMar>
+              <w:top w:w="60" w:type="dxa"/>
+              <w:bottom w:w="60" w:type="dxa"/>
+              <w:start w:w="110" w:type="dxa"/>
+              <w:end w:w="110" w:type="dxa"/>
+            </w:tcMar>
+          </w:tcPr>
+          <w:p>
+            <w:pPr>
+              <w:spacing w:after="40" w:before="20"/>
+            </w:pPr>
+            <w:r>
+              <w:rPr>
+                <w:rFonts w:ascii="Calibri" w:hAnsi="Calibri"/>
+                <w:b w:val="0"/>
+                <w:i w:val="0"/>
+                <w:color w:val="222A2E"/>
+                <w:sz w:val="20"/>
+              </w:rPr>
+              <w:t>Daily (Must be renewed every shift)</w:t>
+            </w:r>
+          </w:p>
+        </w:tc>
+      </w:tr>
+      <w:tr>
+        <w:tc>
+          <w:tcPr>
+            <w:tcW w:type="dxa" w:w="2494"/>
+            <w:tcMar>
+              <w:top w:w="60" w:type="dxa"/>
+              <w:bottom w:w="60" w:type="dxa"/>
+              <w:start w:w="110" w:type="dxa"/>
+              <w:end w:w="110" w:type="dxa"/>
+            </w:tcMar>
+            <w:shd w:val="clear" w:color="auto" w:fill="DCEFF1"/>
+            <w:vAlign w:val="center"/>
+          </w:tcPr>
+          <w:p>
+            <w:pPr>
+              <w:spacing w:after="40" w:before="20"/>
+            </w:pPr>
+            <w:r>
+              <w:rPr>
+                <w:rFonts w:ascii="Calibri" w:hAnsi="Calibri"/>
+                <w:b/>
+                <w:i w:val="0"/>
+                <w:color w:val="003B4A"/>
+                <w:sz w:val="19"/>
+              </w:rPr>
+              <w:t>Scope of Activities Covered</w:t>
+            </w:r>
+          </w:p>
+        </w:tc>
+        <w:tc>
+          <w:tcPr>
+            <w:tcW w:type="dxa" w:w="7370"/>
+            <w:tcMar>
+              <w:top w:w="60" w:type="dxa"/>
+              <w:bottom w:w="60" w:type="dxa"/>
+              <w:start w:w="110" w:type="dxa"/>
+              <w:end w:w="110" w:type="dxa"/>
+            </w:tcMar>
+          </w:tcPr>
+          <w:p>
+            <w:pPr>
+              <w:spacing w:after="40" w:before="20"/>
+            </w:pPr>
+            <w:r>
+              <w:rPr>
+                <w:rFonts w:ascii="Calibri" w:hAnsi="Calibri"/>
+                <w:b w:val="0"/>
+                <w:i w:val="0"/>
+                <w:color w:val="222A2E"/>
+                <w:sz w:val="20"/>
+              </w:rPr>
+              <w:t>ALL lifting operations using mobile cranes, tower cranes, overhead cranes, or heavy rigging gear without exception. Critical lifts (e.g., loads &gt; 75% of crane rated capacity, multi-crane lifts, lifts over live plant / energized equipment, tandem or non-routine heavy rigging) require a detailed, engineered Lifting Plan prepared, reviewed and approved by a competent lifting authority. Routine lifts (well within crane capacity, standard rigging) may proceed under a standard lift plan / rigging checklist attached to the permit.</w:t>
+            </w:r>
+          </w:p>
+        </w:tc>
+      </w:tr>
+      <w:tr>
+        <w:tc>
+          <w:tcPr>
+            <w:tcW w:type="dxa" w:w="2494"/>
+            <w:tcMar>
+              <w:top w:w="60" w:type="dxa"/>
+              <w:bottom w:w="60" w:type="dxa"/>
+              <w:start w:w="110" w:type="dxa"/>
+              <w:end w:w="110" w:type="dxa"/>
+            </w:tcMar>
+            <w:shd w:val="clear" w:color="auto" w:fill="DCEFF1"/>
+            <w:vAlign w:val="center"/>
+          </w:tcPr>
+          <w:p>
+            <w:pPr>
+              <w:spacing w:after="40" w:before="20"/>
+            </w:pPr>
+            <w:r>
+              <w:rPr>
+                <w:rFonts w:ascii="Calibri" w:hAnsi="Calibri"/>
+                <w:b/>
+                <w:i w:val="0"/>
+                <w:color w:val="003B4A"/>
+                <w:sz w:val="19"/>
+              </w:rPr>
+              <w:t>Mandatory Prerequisites &amp; Attachments</w:t>
+            </w:r>
+          </w:p>
+        </w:tc>
+        <w:tc>
+          <w:tcPr>
+            <w:tcW w:type="dxa" w:w="7370"/>
+            <w:tcMar>
+              <w:top w:w="60" w:type="dxa"/>
+              <w:bottom w:w="60" w:type="dxa"/>
+              <w:start w:w="110" w:type="dxa"/>
+              <w:end w:w="110" w:type="dxa"/>
+            </w:tcMar>
+          </w:tcPr>
+          <w:p>
+            <w:pPr>
+              <w:spacing w:after="40" w:before="20"/>
+            </w:pPr>
+            <w:r>
+              <w:rPr>
+                <w:rFonts w:ascii="Calibri" w:hAnsi="Calibri"/>
+                <w:b w:val="0"/>
+                <w:i w:val="0"/>
+                <w:color w:val="222A2E"/>
+                <w:sz w:val="20"/>
+              </w:rPr>
+              <w:t>LIFTING PLAN – mandatory &amp; detailed for critical lifts; standard lift plan / rigging checklist for routine lifts (classified by the appointed lift planner). 3rd-party crane &amp; tackle certificates. Operator &amp; Rigger competency cards.</w:t>
+            </w:r>
+          </w:p>
+        </w:tc>
+      </w:tr>
+      <w:tr>
+        <w:tc>
+          <w:tcPr>
+            <w:tcW w:type="dxa" w:w="2494"/>
+            <w:tcMar>
+              <w:top w:w="60" w:type="dxa"/>
+              <w:bottom w:w="60" w:type="dxa"/>
+              <w:start w:w="110" w:type="dxa"/>
+              <w:end w:w="110" w:type="dxa"/>
+            </w:tcMar>
+            <w:shd w:val="clear" w:color="auto" w:fill="DCEFF1"/>
+            <w:vAlign w:val="center"/>
+          </w:tcPr>
+          <w:p>
+            <w:pPr>
+              <w:spacing w:after="40" w:before="20"/>
+            </w:pPr>
+            <w:r>
+              <w:rPr>
+                <w:rFonts w:ascii="Calibri" w:hAnsi="Calibri"/>
+                <w:b/>
+                <w:i w:val="0"/>
+                <w:color w:val="003B4A"/>
+                <w:sz w:val="19"/>
+              </w:rPr>
+              <w:t>Key On-Site Control Measures</w:t>
+            </w:r>
+          </w:p>
+        </w:tc>
+        <w:tc>
+          <w:tcPr>
+            <w:tcW w:type="dxa" w:w="7370"/>
+            <w:tcMar>
+              <w:top w:w="60" w:type="dxa"/>
+              <w:bottom w:w="60" w:type="dxa"/>
+              <w:start w:w="110" w:type="dxa"/>
+              <w:end w:w="110" w:type="dxa"/>
+            </w:tcMar>
+          </w:tcPr>
+          <w:p>
+            <w:pPr>
+              <w:spacing w:after="40" w:before="20"/>
+            </w:pPr>
+            <w:r>
+              <w:rPr>
+                <w:rFonts w:ascii="Calibri" w:hAnsi="Calibri"/>
+                <w:b w:val="0"/>
+                <w:i w:val="0"/>
+                <w:color w:val="222A2E"/>
+                <w:sz w:val="20"/>
+              </w:rPr>
+              <w:t>Outriggers 100% extended on timber pads. Barricaded exclusion zone around swing radius. Taglines for load control; no lifts in winds &gt; 32 km/h.</w:t>
+            </w:r>
+          </w:p>
+        </w:tc>
+      </w:tr>
+      <w:tr>
+        <w:tc>
+          <w:tcPr>
+            <w:tcW w:type="dxa" w:w="7370"/>
+            <w:gridSpan w:val="2"/>
+            <w:shd w:val="clear" w:color="auto" w:fill="007E8C"/>
+            <w:tcMar>
+              <w:top w:w="70" w:type="dxa"/>
+              <w:bottom w:w="70" w:type="dxa"/>
+              <w:start w:w="110" w:type="dxa"/>
+              <w:end w:w="110" w:type="dxa"/>
+            </w:tcMar>
+          </w:tcPr>
+          <w:p>
+            <w:pPr>
+              <w:spacing w:after="40" w:before="20"/>
+            </w:pPr>
+            <w:r>
+              <w:rPr>
+                <w:rFonts w:ascii="Calibri" w:hAnsi="Calibri"/>
+                <w:b/>
+                <w:i w:val="0"/>
+                <w:color w:val="FFFFFF"/>
+                <w:sz w:val="21"/>
+              </w:rPr>
+              <w:t>8. Work at Height Permit</w:t>
+            </w:r>
+          </w:p>
+        </w:tc>
+      </w:tr>
+      <w:tr>
+        <w:tc>
+          <w:tcPr>
+            <w:tcW w:type="dxa" w:w="2494"/>
+            <w:tcMar>
+              <w:top w:w="60" w:type="dxa"/>
+              <w:bottom w:w="60" w:type="dxa"/>
+              <w:start w:w="110" w:type="dxa"/>
+              <w:end w:w="110" w:type="dxa"/>
+            </w:tcMar>
+            <w:shd w:val="clear" w:color="auto" w:fill="DCEFF1"/>
+            <w:vAlign w:val="center"/>
+          </w:tcPr>
+          <w:p>
+            <w:pPr>
+              <w:spacing w:after="40" w:before="20"/>
+            </w:pPr>
+            <w:r>
+              <w:rPr>
+                <w:rFonts w:ascii="Calibri" w:hAnsi="Calibri"/>
+                <w:b/>
+                <w:i w:val="0"/>
+                <w:color w:val="003B4A"/>
+                <w:sz w:val="19"/>
+              </w:rPr>
+              <w:t>Validity / Renewal</w:t>
+            </w:r>
+          </w:p>
+        </w:tc>
+        <w:tc>
+          <w:tcPr>
+            <w:tcW w:type="dxa" w:w="7370"/>
+            <w:tcMar>
+              <w:top w:w="60" w:type="dxa"/>
+              <w:bottom w:w="60" w:type="dxa"/>
+              <w:start w:w="110" w:type="dxa"/>
+              <w:end w:w="110" w:type="dxa"/>
+            </w:tcMar>
+            <w:shd w:val="clear" w:color="auto" w:fill="F7FBFB"/>
+          </w:tcPr>
+          <w:p>
+            <w:pPr>
+              <w:spacing w:after="40" w:before="20"/>
+            </w:pPr>
+            <w:r>
+              <w:rPr>
+                <w:rFonts w:ascii="Calibri" w:hAnsi="Calibri"/>
+                <w:b w:val="0"/>
+                <w:i w:val="0"/>
+                <w:color w:val="222A2E"/>
+                <w:sz w:val="20"/>
+              </w:rPr>
+              <w:t>Daily (Must be renewed every shift)</w:t>
+            </w:r>
+          </w:p>
+        </w:tc>
+      </w:tr>
+      <w:tr>
+        <w:tc>
+          <w:tcPr>
+            <w:tcW w:type="dxa" w:w="2494"/>
+            <w:tcMar>
+              <w:top w:w="60" w:type="dxa"/>
+              <w:bottom w:w="60" w:type="dxa"/>
+              <w:start w:w="110" w:type="dxa"/>
+              <w:end w:w="110" w:type="dxa"/>
+            </w:tcMar>
+            <w:shd w:val="clear" w:color="auto" w:fill="DCEFF1"/>
+            <w:vAlign w:val="center"/>
+          </w:tcPr>
+          <w:p>
+            <w:pPr>
+              <w:spacing w:after="40" w:before="20"/>
+            </w:pPr>
+            <w:r>
+              <w:rPr>
+                <w:rFonts w:ascii="Calibri" w:hAnsi="Calibri"/>
+                <w:b/>
+                <w:i w:val="0"/>
+                <w:color w:val="003B4A"/>
+                <w:sz w:val="19"/>
+              </w:rPr>
+              <w:t>Scope of Activities Covered</w:t>
+            </w:r>
+          </w:p>
+        </w:tc>
+        <w:tc>
+          <w:tcPr>
+            <w:tcW w:type="dxa" w:w="7370"/>
+            <w:tcMar>
+              <w:top w:w="60" w:type="dxa"/>
+              <w:bottom w:w="60" w:type="dxa"/>
+              <w:start w:w="110" w:type="dxa"/>
+              <w:end w:w="110" w:type="dxa"/>
+            </w:tcMar>
+            <w:shd w:val="clear" w:color="auto" w:fill="F7FBFB"/>
+          </w:tcPr>
+          <w:p>
+            <w:pPr>
+              <w:spacing w:after="40" w:before="20"/>
+            </w:pPr>
+            <w:r>
+              <w:rPr>
+                <w:rFonts w:ascii="Calibri" w:hAnsi="Calibri"/>
+                <w:b w:val="0"/>
+                <w:i w:val="0"/>
+                <w:color w:val="222A2E"/>
+                <w:sz w:val="20"/>
+              </w:rPr>
+              <w:t>Any task performed at an elevated height of 1.8 meters or above where a fall hazard exists.</w:t>
+            </w:r>
+          </w:p>
+        </w:tc>
+      </w:tr>
+      <w:tr>
+        <w:tc>
+          <w:tcPr>
+            <w:tcW w:type="dxa" w:w="2494"/>
+            <w:tcMar>
+              <w:top w:w="60" w:type="dxa"/>
+              <w:bottom w:w="60" w:type="dxa"/>
+              <w:start w:w="110" w:type="dxa"/>
+              <w:end w:w="110" w:type="dxa"/>
+            </w:tcMar>
+            <w:shd w:val="clear" w:color="auto" w:fill="DCEFF1"/>
+            <w:vAlign w:val="center"/>
+          </w:tcPr>
+          <w:p>
+            <w:pPr>
+              <w:spacing w:after="40" w:before="20"/>
+            </w:pPr>
+            <w:r>
+              <w:rPr>
+                <w:rFonts w:ascii="Calibri" w:hAnsi="Calibri"/>
+                <w:b/>
+                <w:i w:val="0"/>
+                <w:color w:val="003B4A"/>
+                <w:sz w:val="19"/>
+              </w:rPr>
+              <w:t>Mandatory Prerequisites &amp; Attachments</w:t>
+            </w:r>
+          </w:p>
+        </w:tc>
+        <w:tc>
+          <w:tcPr>
+            <w:tcW w:type="dxa" w:w="7370"/>
+            <w:tcMar>
+              <w:top w:w="60" w:type="dxa"/>
+              <w:bottom w:w="60" w:type="dxa"/>
+              <w:start w:w="110" w:type="dxa"/>
+              <w:end w:w="110" w:type="dxa"/>
+            </w:tcMar>
+            <w:shd w:val="clear" w:color="auto" w:fill="F7FBFB"/>
+          </w:tcPr>
+          <w:p>
+            <w:pPr>
+              <w:spacing w:after="40" w:before="20"/>
+            </w:pPr>
+            <w:r>
+              <w:rPr>
+                <w:rFonts w:ascii="Calibri" w:hAnsi="Calibri"/>
+                <w:b w:val="0"/>
+                <w:i w:val="0"/>
+                <w:color w:val="222A2E"/>
+                <w:sz w:val="20"/>
+              </w:rPr>
+              <w:t>Scaffold Green Inspection Tag. Fall Protection Plan &amp; JSA.</w:t>
+            </w:r>
+          </w:p>
+        </w:tc>
+      </w:tr>
+      <w:tr>
+        <w:tc>
+          <w:tcPr>
+            <w:tcW w:type="dxa" w:w="2494"/>
+            <w:tcMar>
+              <w:top w:w="60" w:type="dxa"/>
+              <w:bottom w:w="60" w:type="dxa"/>
+              <w:start w:w="110" w:type="dxa"/>
+              <w:end w:w="110" w:type="dxa"/>
+            </w:tcMar>
+            <w:shd w:val="clear" w:color="auto" w:fill="DCEFF1"/>
+            <w:vAlign w:val="center"/>
+          </w:tcPr>
+          <w:p>
+            <w:pPr>
+              <w:spacing w:after="40" w:before="20"/>
+            </w:pPr>
+            <w:r>
+              <w:rPr>
+                <w:rFonts w:ascii="Calibri" w:hAnsi="Calibri"/>
+                <w:b/>
+                <w:i w:val="0"/>
+                <w:color w:val="003B4A"/>
+                <w:sz w:val="19"/>
+              </w:rPr>
+              <w:t>Key On-Site Control Measures</w:t>
+            </w:r>
+          </w:p>
+        </w:tc>
+        <w:tc>
+          <w:tcPr>
+            <w:tcW w:type="dxa" w:w="7370"/>
+            <w:tcMar>
+              <w:top w:w="60" w:type="dxa"/>
+              <w:bottom w:w="60" w:type="dxa"/>
+              <w:start w:w="110" w:type="dxa"/>
+              <w:end w:w="110" w:type="dxa"/>
+            </w:tcMar>
+            <w:shd w:val="clear" w:color="auto" w:fill="F7FBFB"/>
+          </w:tcPr>
+          <w:p>
+            <w:pPr>
+              <w:spacing w:after="40" w:before="20"/>
+            </w:pPr>
+            <w:r>
+              <w:rPr>
+                <w:rFonts w:ascii="Calibri" w:hAnsi="Calibri"/>
+                <w:b w:val="0"/>
+                <w:i w:val="0"/>
+                <w:color w:val="222A2E"/>
+                <w:sz w:val="20"/>
+              </w:rPr>
+              <w:t>100% tie-off using double lanyard harnesses with shock absorbers attached to certified anchor points (&gt; 22 kN). Toe-boards and handrails installed on all working platforms.</w:t>
+            </w:r>
+          </w:p>
+        </w:tc>
+      </w:tr>
+      <w:tr>
+        <w:tc>
+          <w:tcPr>
+            <w:tcW w:type="dxa" w:w="7370"/>
+            <w:gridSpan w:val="2"/>
+            <w:shd w:val="clear" w:color="auto" w:fill="007E8C"/>
+            <w:tcMar>
+              <w:top w:w="70" w:type="dxa"/>
+              <w:bottom w:w="70" w:type="dxa"/>
+              <w:start w:w="110" w:type="dxa"/>
+              <w:end w:w="110" w:type="dxa"/>
+            </w:tcMar>
+          </w:tcPr>
+          <w:p>
+            <w:pPr>
+              <w:spacing w:after="40" w:before="20"/>
+            </w:pPr>
+            <w:r>
+              <w:rPr>
+                <w:rFonts w:ascii="Calibri" w:hAnsi="Calibri"/>
+                <w:b/>
+                <w:i w:val="0"/>
+                <w:color w:val="FFFFFF"/>
+                <w:sz w:val="21"/>
+              </w:rPr>
+              <w:t>9. Confined Space Entry Permit</w:t>
+            </w:r>
+          </w:p>
+        </w:tc>
+      </w:tr>
+      <w:tr>
+        <w:tc>
+          <w:tcPr>
+            <w:tcW w:type="dxa" w:w="2494"/>
+            <w:tcMar>
+              <w:top w:w="60" w:type="dxa"/>
+              <w:bottom w:w="60" w:type="dxa"/>
+              <w:start w:w="110" w:type="dxa"/>
+              <w:end w:w="110" w:type="dxa"/>
+            </w:tcMar>
+            <w:shd w:val="clear" w:color="auto" w:fill="DCEFF1"/>
+            <w:vAlign w:val="center"/>
+          </w:tcPr>
+          <w:p>
+            <w:pPr>
+              <w:spacing w:after="40" w:before="20"/>
+            </w:pPr>
+            <w:r>
+              <w:rPr>
+                <w:rFonts w:ascii="Calibri" w:hAnsi="Calibri"/>
+                <w:b/>
+                <w:i w:val="0"/>
+                <w:color w:val="003B4A"/>
+                <w:sz w:val="19"/>
+              </w:rPr>
+              <w:t>Validity / Renewal</w:t>
+            </w:r>
+          </w:p>
+        </w:tc>
+        <w:tc>
+          <w:tcPr>
+            <w:tcW w:type="dxa" w:w="7370"/>
+            <w:tcMar>
+              <w:top w:w="60" w:type="dxa"/>
+              <w:bottom w:w="60" w:type="dxa"/>
+              <w:start w:w="110" w:type="dxa"/>
+              <w:end w:w="110" w:type="dxa"/>
+            </w:tcMar>
+          </w:tcPr>
+          <w:p>
+            <w:pPr>
+              <w:spacing w:after="40" w:before="20"/>
+            </w:pPr>
+            <w:r>
+              <w:rPr>
+                <w:rFonts w:ascii="Calibri" w:hAnsi="Calibri"/>
+                <w:b w:val="0"/>
+                <w:i w:val="0"/>
+                <w:color w:val="222A2E"/>
+                <w:sz w:val="20"/>
+              </w:rPr>
+              <w:t>Daily (Must be renewed every shift)</w:t>
+            </w:r>
+          </w:p>
+        </w:tc>
+      </w:tr>
+      <w:tr>
+        <w:tc>
+          <w:tcPr>
+            <w:tcW w:type="dxa" w:w="2494"/>
+            <w:tcMar>
+              <w:top w:w="60" w:type="dxa"/>
+              <w:bottom w:w="60" w:type="dxa"/>
+              <w:start w:w="110" w:type="dxa"/>
+              <w:end w:w="110" w:type="dxa"/>
+            </w:tcMar>
+            <w:shd w:val="clear" w:color="auto" w:fill="DCEFF1"/>
+            <w:vAlign w:val="center"/>
+          </w:tcPr>
+          <w:p>
+            <w:pPr>
+              <w:spacing w:after="40" w:before="20"/>
+            </w:pPr>
+            <w:r>
+              <w:rPr>
+                <w:rFonts w:ascii="Calibri" w:hAnsi="Calibri"/>
+                <w:b/>
+                <w:i w:val="0"/>
+                <w:color w:val="003B4A"/>
+                <w:sz w:val="19"/>
+              </w:rPr>
+              <w:t>Scope of Activities Covered</w:t>
+            </w:r>
+          </w:p>
+        </w:tc>
+        <w:tc>
+          <w:tcPr>
+            <w:tcW w:type="dxa" w:w="7370"/>
+            <w:tcMar>
+              <w:top w:w="60" w:type="dxa"/>
+              <w:bottom w:w="60" w:type="dxa"/>
+              <w:start w:w="110" w:type="dxa"/>
+              <w:end w:w="110" w:type="dxa"/>
+            </w:tcMar>
+          </w:tcPr>
+          <w:p>
+            <w:pPr>
+              <w:spacing w:after="40" w:before="20"/>
+            </w:pPr>
+            <w:r>
+              <w:rPr>
+                <w:rFonts w:ascii="Calibri" w:hAnsi="Calibri"/>
+                <w:b w:val="0"/>
+                <w:i w:val="0"/>
+                <w:color w:val="222A2E"/>
+                <w:sz w:val="20"/>
+              </w:rPr>
+              <w:t>Entry into tanks, pressure vessels, underground ducts/vaults, manholes or other enclosures classified as confined spaces on the basis of risk assessment and atmospheric evaluation (restricted entry/exit and actual or potential hazardous atmosphere). Excavations and trenches are governed by the Excavation &amp; Trenching Permit and are treated as confined spaces only where a specific confined-space risk assessment so determines — depth alone does not define a confined space.</w:t>
+            </w:r>
+          </w:p>
+        </w:tc>
+      </w:tr>
+      <w:tr>
+        <w:tc>
+          <w:tcPr>
+            <w:tcW w:type="dxa" w:w="2494"/>
+            <w:tcMar>
+              <w:top w:w="60" w:type="dxa"/>
+              <w:bottom w:w="60" w:type="dxa"/>
+              <w:start w:w="110" w:type="dxa"/>
+              <w:end w:w="110" w:type="dxa"/>
+            </w:tcMar>
+            <w:shd w:val="clear" w:color="auto" w:fill="DCEFF1"/>
+            <w:vAlign w:val="center"/>
+          </w:tcPr>
+          <w:p>
+            <w:pPr>
+              <w:spacing w:after="40" w:before="20"/>
+            </w:pPr>
+            <w:r>
+              <w:rPr>
+                <w:rFonts w:ascii="Calibri" w:hAnsi="Calibri"/>
+                <w:b/>
+                <w:i w:val="0"/>
+                <w:color w:val="003B4A"/>
+                <w:sz w:val="19"/>
+              </w:rPr>
+              <w:t>Mandatory Prerequisites &amp; Attachments</w:t>
+            </w:r>
+          </w:p>
+        </w:tc>
+        <w:tc>
+          <w:tcPr>
+            <w:tcW w:type="dxa" w:w="7370"/>
+            <w:tcMar>
+              <w:top w:w="60" w:type="dxa"/>
+              <w:bottom w:w="60" w:type="dxa"/>
+              <w:start w:w="110" w:type="dxa"/>
+              <w:end w:w="110" w:type="dxa"/>
+            </w:tcMar>
+          </w:tcPr>
+          <w:p>
+            <w:pPr>
+              <w:spacing w:after="40" w:before="20"/>
+            </w:pPr>
+            <w:r>
+              <w:rPr>
+                <w:rFonts w:ascii="Calibri" w:hAnsi="Calibri"/>
+                <w:b w:val="0"/>
+                <w:i w:val="0"/>
+                <w:color w:val="222A2E"/>
+                <w:sz w:val="20"/>
+              </w:rPr>
+              <w:t>Approved JSA &amp; Emergency Rescue Plan. AGT Gas Test Log (O2, LEL, H2S, CO). Electrical &amp; Energy Isolation (LOTO) Certificate.</w:t>
+            </w:r>
+          </w:p>
+        </w:tc>
+      </w:tr>
+      <w:tr>
+        <w:tc>
+          <w:tcPr>
+            <w:tcW w:type="dxa" w:w="2494"/>
+            <w:tcMar>
+              <w:top w:w="60" w:type="dxa"/>
+              <w:bottom w:w="60" w:type="dxa"/>
+              <w:start w:w="110" w:type="dxa"/>
+              <w:end w:w="110" w:type="dxa"/>
+            </w:tcMar>
+            <w:shd w:val="clear" w:color="auto" w:fill="DCEFF1"/>
+            <w:vAlign w:val="center"/>
+          </w:tcPr>
+          <w:p>
+            <w:pPr>
+              <w:spacing w:after="40" w:before="20"/>
+            </w:pPr>
+            <w:r>
+              <w:rPr>
+                <w:rFonts w:ascii="Calibri" w:hAnsi="Calibri"/>
+                <w:b/>
+                <w:i w:val="0"/>
+                <w:color w:val="003B4A"/>
+                <w:sz w:val="19"/>
+              </w:rPr>
+              <w:t>Key On-Site Control Measures</w:t>
+            </w:r>
+          </w:p>
+        </w:tc>
+        <w:tc>
+          <w:tcPr>
+            <w:tcW w:type="dxa" w:w="7370"/>
+            <w:tcMar>
+              <w:top w:w="60" w:type="dxa"/>
+              <w:bottom w:w="60" w:type="dxa"/>
+              <w:start w:w="110" w:type="dxa"/>
+              <w:end w:w="110" w:type="dxa"/>
+            </w:tcMar>
+          </w:tcPr>
+          <w:p>
+            <w:pPr>
+              <w:spacing w:after="40" w:before="20"/>
+            </w:pPr>
+            <w:r>
+              <w:rPr>
+                <w:rFonts w:ascii="Calibri" w:hAnsi="Calibri"/>
+                <w:b w:val="0"/>
+                <w:i w:val="0"/>
+                <w:color w:val="222A2E"/>
+                <w:sz w:val="20"/>
               </w:rPr>
               <w:t>Continuous mechanical ventilation. Stationed Standby Entrant/Attendant at entry point with logbook. Full-body harness connected to tripod rescue winch. Confined-space classification confirmed by documented risk assessment before entry.</w:t>
             </w:r>
@@ -2585,7 +3484,6 @@
         <w:tblW w:type="auto" w:w="0"/>
         <w:tblLayout w:type="fixed"/>
         <w:tblLook w:firstColumn="1" w:firstRow="1" w:lastColumn="0" w:lastRow="0" w:noHBand="0" w:noVBand="1" w:val="04A0"/>
-        <w:tblLayout w:type="fixed"/>
         <w:tblBorders>
           <w:top w:val="single" w:sz="4" w:space="0" w:color="B7CCCF"/>
           <w:left w:val="single" w:sz="4" w:space="0" w:color="B7CCCF"/>
@@ -2594,10 +3492,11 @@
           <w:insideH w:val="single" w:sz="4" w:space="0" w:color="B7CCCF"/>
           <w:insideV w:val="single" w:sz="4" w:space="0" w:color="B7CCCF"/>
         </w:tblBorders>
+        <w:tblLayout w:type="fixed"/>
       </w:tblPr>
       <w:tblGrid>
-        <w:gridCol w:w="4933"/>
-        <w:gridCol w:w="4933"/>
+        <w:gridCol w:w="4932"/>
+        <w:gridCol w:w="4932"/>
       </w:tblGrid>
       <w:tr>
         <w:tc>
@@ -2676,7 +3575,7 @@
                 <w:b w:val="0"/>
                 <w:i w:val="0"/>
                 <w:color w:val="222A2E"/>
-                <w:sz w:val="19"/>
+                <w:sz w:val="20"/>
               </w:rPr>
               <w:t>▪  General Cold Work Permit</w:t>
             </w:r>
@@ -2702,7 +3601,7 @@
                 <w:b w:val="0"/>
                 <w:i w:val="0"/>
                 <w:color w:val="222A2E"/>
-                <w:sz w:val="19"/>
+                <w:sz w:val="20"/>
               </w:rPr>
               <w:t>▪  Electrical Hot Work &amp; Commissioning Permit (Energized / Testing)</w:t>
             </w:r>
@@ -2731,7 +3630,7 @@
                 <w:b w:val="0"/>
                 <w:i w:val="0"/>
                 <w:color w:val="222A2E"/>
-                <w:sz w:val="19"/>
+                <w:sz w:val="20"/>
               </w:rPr>
               <w:t>▪  Electrical Cold Work Permit (Installation / Non-Energized)</w:t>
             </w:r>
@@ -2758,7 +3657,7 @@
                 <w:b w:val="0"/>
                 <w:i w:val="0"/>
                 <w:color w:val="222A2E"/>
-                <w:sz w:val="19"/>
+                <w:sz w:val="20"/>
               </w:rPr>
               <w:t>▪  Energy Isolation (LOTO) Permit</w:t>
             </w:r>
@@ -2786,7 +3685,7 @@
                 <w:b w:val="0"/>
                 <w:i w:val="0"/>
                 <w:color w:val="222A2E"/>
-                <w:sz w:val="19"/>
+                <w:sz w:val="20"/>
               </w:rPr>
               <w:t>▪  Excavation &amp; Trenching Permit</w:t>
             </w:r>
@@ -2812,7 +3711,7 @@
                 <w:b w:val="0"/>
                 <w:i w:val="0"/>
                 <w:color w:val="222A2E"/>
-                <w:sz w:val="19"/>
+                <w:sz w:val="20"/>
               </w:rPr>
               <w:t>▪  Hot Work Permit (Thermal / Welding / Cutting)</w:t>
             </w:r>
@@ -2841,7 +3740,7 @@
                 <w:b w:val="0"/>
                 <w:i w:val="0"/>
                 <w:color w:val="222A2E"/>
-                <w:sz w:val="19"/>
+                <w:sz w:val="20"/>
               </w:rPr>
             </w:r>
           </w:p>
@@ -2867,7 +3766,7 @@
                 <w:b w:val="0"/>
                 <w:i w:val="0"/>
                 <w:color w:val="222A2E"/>
-                <w:sz w:val="19"/>
+                <w:sz w:val="20"/>
               </w:rPr>
               <w:t>▪  Lifting Permit (Cranes &amp; Heavy Rigging)</w:t>
             </w:r>
@@ -2895,7 +3794,7 @@
                 <w:b w:val="0"/>
                 <w:i w:val="0"/>
                 <w:color w:val="222A2E"/>
-                <w:sz w:val="19"/>
+                <w:sz w:val="20"/>
               </w:rPr>
             </w:r>
           </w:p>
@@ -2920,7 +3819,7 @@
                 <w:b w:val="0"/>
                 <w:i w:val="0"/>
                 <w:color w:val="222A2E"/>
-                <w:sz w:val="19"/>
+                <w:sz w:val="20"/>
               </w:rPr>
               <w:t>▪  Work at Height Permit (≥ 1.8 m)</w:t>
             </w:r>
@@ -2949,7 +3848,7 @@
                 <w:b w:val="0"/>
                 <w:i w:val="0"/>
                 <w:color w:val="222A2E"/>
-                <w:sz w:val="19"/>
+                <w:sz w:val="20"/>
               </w:rPr>
             </w:r>
           </w:p>
@@ -2975,7 +3874,7 @@
                 <w:b w:val="0"/>
                 <w:i w:val="0"/>
                 <w:color w:val="222A2E"/>
-                <w:sz w:val="19"/>
+                <w:sz w:val="20"/>
               </w:rPr>
               <w:t>▪  Confined Space Entry Permit</w:t>
             </w:r>
@@ -3019,7 +3918,6 @@
         <w:tblW w:type="auto" w:w="0"/>
         <w:tblLayout w:type="fixed"/>
         <w:tblLook w:firstColumn="1" w:firstRow="1" w:lastColumn="0" w:lastRow="0" w:noHBand="0" w:noVBand="1" w:val="04A0"/>
-        <w:tblLayout w:type="fixed"/>
         <w:tblBorders>
           <w:top w:val="single" w:sz="4" w:space="0" w:color="B7CCCF"/>
           <w:left w:val="single" w:sz="4" w:space="0" w:color="B7CCCF"/>
@@ -3028,15 +3926,16 @@
           <w:insideH w:val="single" w:sz="4" w:space="0" w:color="B7CCCF"/>
           <w:insideV w:val="single" w:sz="4" w:space="0" w:color="B7CCCF"/>
         </w:tblBorders>
+        <w:tblLayout w:type="fixed"/>
       </w:tblPr>
       <w:tblGrid>
-        <w:gridCol w:w="4933"/>
-        <w:gridCol w:w="4933"/>
+        <w:gridCol w:w="3061"/>
+        <w:gridCol w:w="6803"/>
       </w:tblGrid>
       <w:tr>
         <w:tc>
           <w:tcPr>
-            <w:tcW w:type="dxa" w:w="2948"/>
+            <w:tcW w:type="dxa" w:w="3061"/>
             <w:tcMar>
               <w:top w:w="60" w:type="dxa"/>
               <w:bottom w:w="60" w:type="dxa"/>
@@ -3056,7 +3955,7 @@
                 <w:b/>
                 <w:i w:val="0"/>
                 <w:color w:val="003B4A"/>
-                <w:sz w:val="19"/>
+                <w:sz w:val="20"/>
               </w:rPr>
               <w:t>STEP 1 — Application &amp; Submission (T-24 Hours)</w:t>
             </w:r>
@@ -3064,7 +3963,7 @@
         </w:tc>
         <w:tc>
           <w:tcPr>
-            <w:tcW w:type="dxa" w:w="6917"/>
+            <w:tcW w:type="dxa" w:w="6803"/>
             <w:tcMar>
               <w:top w:w="60" w:type="dxa"/>
               <w:bottom w:w="60" w:type="dxa"/>
@@ -3082,7 +3981,7 @@
                 <w:b w:val="0"/>
                 <w:i w:val="0"/>
                 <w:color w:val="222A2E"/>
-                <w:sz w:val="19"/>
+                <w:sz w:val="20"/>
               </w:rPr>
               <w:t>The Permit Holder submits the PTW request along with JSA, Method Statement, and required attachments (e.g., LOTO Isolation Certificate, Mandatory Lifting Plan, Gas Test Log) to EHS at least 24 hours prior to work execution.</w:t>
             </w:r>
@@ -3092,7 +3991,7 @@
       <w:tr>
         <w:tc>
           <w:tcPr>
-            <w:tcW w:type="dxa" w:w="2948"/>
+            <w:tcW w:type="dxa" w:w="3061"/>
             <w:tcMar>
               <w:top w:w="60" w:type="dxa"/>
               <w:bottom w:w="60" w:type="dxa"/>
@@ -3112,7 +4011,7 @@
                 <w:b/>
                 <w:i w:val="0"/>
                 <w:color w:val="003B4A"/>
-                <w:sz w:val="19"/>
+                <w:sz w:val="20"/>
               </w:rPr>
               <w:t>STEP 2 — Joint Field Verification &amp; Issuance</w:t>
             </w:r>
@@ -3120,7 +4019,7 @@
         </w:tc>
         <w:tc>
           <w:tcPr>
-            <w:tcW w:type="dxa" w:w="6917"/>
+            <w:tcW w:type="dxa" w:w="6803"/>
             <w:tcMar>
               <w:top w:w="60" w:type="dxa"/>
               <w:bottom w:w="60" w:type="dxa"/>
@@ -3139,7 +4038,7 @@
                 <w:b w:val="0"/>
                 <w:i w:val="0"/>
                 <w:color w:val="222A2E"/>
-                <w:sz w:val="19"/>
+                <w:sz w:val="20"/>
               </w:rPr>
               <w:t>The Permit Issuer and Permit Holder conduct a physical walk-through of the work site to verify all controls (including zero-energy state verification). Upon satisfaction, both sign the PTW. The original permit is displayed at the work location inside a weatherproof plastic sleeve.</w:t>
             </w:r>
@@ -3149,7 +4048,7 @@
       <w:tr>
         <w:tc>
           <w:tcPr>
-            <w:tcW w:type="dxa" w:w="2948"/>
+            <w:tcW w:type="dxa" w:w="3061"/>
             <w:tcMar>
               <w:top w:w="60" w:type="dxa"/>
               <w:bottom w:w="60" w:type="dxa"/>
@@ -3169,7 +4068,7 @@
                 <w:b/>
                 <w:i w:val="0"/>
                 <w:color w:val="003B4A"/>
-                <w:sz w:val="19"/>
+                <w:sz w:val="20"/>
               </w:rPr>
               <w:t>STEP 3 — Shift Completion &amp; Closure</w:t>
             </w:r>
@@ -3177,7 +4076,7 @@
         </w:tc>
         <w:tc>
           <w:tcPr>
-            <w:tcW w:type="dxa" w:w="6917"/>
+            <w:tcW w:type="dxa" w:w="6803"/>
             <w:tcMar>
               <w:top w:w="60" w:type="dxa"/>
               <w:bottom w:w="60" w:type="dxa"/>
@@ -3195,7 +4094,7 @@
                 <w:b w:val="0"/>
                 <w:i w:val="0"/>
                 <w:color w:val="222A2E"/>
-                <w:sz w:val="19"/>
+                <w:sz w:val="20"/>
               </w:rPr>
               <w:t>At shift end (or task completion), the site is cleaned, tools removed, de-isolation executed if authorized, and the Permit Holder &amp; Issuer sign off the permit closure section. Closed permits are archived at the EHS Office. Daily permits expire at the end of the shift and must be re-issued for subsequent shifts.</w:t>
             </w:r>
@@ -3390,7 +4289,6 @@
         <w:tblW w:type="auto" w:w="0"/>
         <w:tblLayout w:type="fixed"/>
         <w:tblLook w:firstColumn="1" w:firstRow="1" w:lastColumn="0" w:lastRow="0" w:noHBand="0" w:noVBand="1" w:val="04A0"/>
-        <w:tblLayout w:type="fixed"/>
         <w:tblBorders>
           <w:top w:val="single" w:sz="4" w:space="0" w:color="B7CCCF"/>
           <w:left w:val="single" w:sz="4" w:space="0" w:color="B7CCCF"/>
@@ -3399,11 +4297,12 @@
           <w:insideH w:val="single" w:sz="4" w:space="0" w:color="B7CCCF"/>
           <w:insideV w:val="single" w:sz="4" w:space="0" w:color="B7CCCF"/>
         </w:tblBorders>
+        <w:tblLayout w:type="fixed"/>
       </w:tblPr>
       <w:tblGrid>
-        <w:gridCol w:w="3289"/>
-        <w:gridCol w:w="3289"/>
-        <w:gridCol w:w="3289"/>
+        <w:gridCol w:w="3288"/>
+        <w:gridCol w:w="3288"/>
+        <w:gridCol w:w="3288"/>
       </w:tblGrid>
       <w:tr>
         <w:tc>

</xml_diff>

<commit_message>
Redesign Waste Management Manual professionally; use 'Ahmed Mansoor' name only
Co-authored-by: arena-agent <297053741+arena-agent@users.noreply.github.com>
</commit_message>
<xml_diff>
--- a/بيرمت سستم (Final).docx
+++ b/بيرمت سستم (Final).docx
@@ -343,7 +343,7 @@
                 <w:color w:val="222A2E"/>
                 <w:sz w:val="20"/>
               </w:rPr>
-              <w:t>Ahmed Mansoor Hashim Kazem (EHS Manager)</w:t>
+              <w:t>Ahmed Mansoor (EHS Manager)</w:t>
             </w:r>
           </w:p>
         </w:tc>
@@ -4417,7 +4417,7 @@
                 <w:color w:val="222A2E"/>
                 <w:sz w:val="19"/>
               </w:rPr>
-              <w:t>Name: Ahmed Mansoor Hashim Kazem</w:t>
+              <w:t>Name: Ahmed Mansoor</w:t>
             </w:r>
           </w:p>
           <w:p>

</xml_diff>